<commit_message>
docs: agregar diagrama de funcionamiento v1
</commit_message>
<xml_diff>
--- a/docs/evidencias/antes/NotaFácil – Sistema de gestión de notas académicas.docx
+++ b/docs/evidencias/antes/NotaFácil – Sistema de gestión de notas académicas.docx
@@ -505,6 +505,9 @@
     </w:p>
     <w:p>
       <w:r>
+        <w:rPr>
+          <w:noProof/>
+        </w:rPr>
         <w:drawing>
           <wp:inline distT="0" distB="0" distL="0" distR="0" wp14:anchorId="442D9593" wp14:editId="5AFD9358">
             <wp:extent cx="4114800" cy="2560227"/>
@@ -602,6 +605,9 @@
         <w:br/>
       </w:r>
       <w:r>
+        <w:rPr>
+          <w:noProof/>
+        </w:rPr>
         <w:drawing>
           <wp:inline distT="0" distB="0" distL="0" distR="0" wp14:anchorId="66CCDA53" wp14:editId="1581AD69">
             <wp:extent cx="4143375" cy="3049164"/>
@@ -691,6 +697,9 @@
     </w:p>
     <w:p>
       <w:r>
+        <w:rPr>
+          <w:noProof/>
+        </w:rPr>
         <w:drawing>
           <wp:inline distT="0" distB="0" distL="0" distR="0" wp14:anchorId="5F64D0F8" wp14:editId="290170FD">
             <wp:extent cx="4189054" cy="1990725"/>
@@ -751,6 +760,9 @@
         </w:rPr>
       </w:pPr>
       <w:r>
+        <w:rPr>
+          <w:noProof/>
+        </w:rPr>
         <w:drawing>
           <wp:inline distT="0" distB="0" distL="0" distR="0" wp14:anchorId="09A3444F" wp14:editId="002C922C">
             <wp:extent cx="4219575" cy="1747891"/>
@@ -908,6 +920,9 @@
     </w:p>
     <w:p>
       <w:r>
+        <w:rPr>
+          <w:noProof/>
+        </w:rPr>
         <w:drawing>
           <wp:inline distT="0" distB="0" distL="0" distR="0" wp14:anchorId="75C09657" wp14:editId="642F68A2">
             <wp:extent cx="4144488" cy="938817"/>
@@ -956,6 +971,7 @@
         <w:rPr>
           <w:b/>
           <w:bCs/>
+          <w:noProof/>
         </w:rPr>
         <w:drawing>
           <wp:inline distT="0" distB="0" distL="0" distR="0" wp14:anchorId="32158517" wp14:editId="581E50AC">
@@ -1096,6 +1112,9 @@
     </w:p>
     <w:p>
       <w:r>
+        <w:rPr>
+          <w:noProof/>
+        </w:rPr>
         <w:drawing>
           <wp:inline distT="0" distB="0" distL="0" distR="0" wp14:anchorId="01CF3D06" wp14:editId="6D371505">
             <wp:extent cx="4144010" cy="2509475"/>
@@ -1133,8 +1152,15 @@
         </w:drawing>
       </w:r>
     </w:p>
-    <w:p>
-      <w:r>
+    <w:p/>
+    <w:p/>
+    <w:p/>
+    <w:p/>
+    <w:p>
+      <w:r>
+        <w:rPr>
+          <w:noProof/>
+        </w:rPr>
         <w:lastRenderedPageBreak/>
         <w:drawing>
           <wp:inline distT="0" distB="0" distL="0" distR="0" wp14:anchorId="1FA2B0D9" wp14:editId="60B13239">
@@ -1175,6 +1201,9 @@
     </w:p>
     <w:p>
       <w:r>
+        <w:rPr>
+          <w:noProof/>
+        </w:rPr>
         <w:drawing>
           <wp:inline distT="0" distB="0" distL="0" distR="0" wp14:anchorId="743D2DEF" wp14:editId="3B3F2139">
             <wp:extent cx="4132613" cy="1751146"/>
@@ -1214,6 +1243,9 @@
     </w:p>
     <w:p>
       <w:r>
+        <w:rPr>
+          <w:noProof/>
+        </w:rPr>
         <w:drawing>
           <wp:inline distT="0" distB="0" distL="0" distR="0" wp14:anchorId="7EEF013E" wp14:editId="7337DC23">
             <wp:extent cx="4108862" cy="2479357"/>
@@ -1353,6 +1385,9 @@
     </w:p>
     <w:p>
       <w:r>
+        <w:rPr>
+          <w:noProof/>
+        </w:rPr>
         <w:drawing>
           <wp:inline distT="0" distB="0" distL="0" distR="0" wp14:anchorId="35581185" wp14:editId="203C85B0">
             <wp:extent cx="4251366" cy="929355"/>
@@ -1408,6 +1443,1137 @@
       <w:proofErr w:type="gramEnd"/>
       <w:r>
         <w:t xml:space="preserve"> que tiene unas 250 líneas y hace todo.</w:t>
+      </w:r>
+    </w:p>
+    <w:p>
+      <w:r>
+        <w:rPr>
+          <w:highlight w:val="yellow"/>
+        </w:rPr>
+        <w:lastRenderedPageBreak/>
+        <w:t xml:space="preserve">Vamos más o menos por el </w:t>
+      </w:r>
+      <w:r>
+        <w:rPr>
+          <w:b/>
+          <w:bCs/>
+          <w:highlight w:val="yellow"/>
+        </w:rPr>
+        <w:t>20% del trabajo</w:t>
+      </w:r>
+      <w:r>
+        <w:rPr>
+          <w:highlight w:val="yellow"/>
+        </w:rPr>
+        <w:t>. Terminamos la preparación y parte del diagnóstico. Así está cada punto del enunciado:</w:t>
+      </w:r>
+    </w:p>
+    <w:tbl>
+      <w:tblPr>
+        <w:tblStyle w:val="Tablanormal1"/>
+        <w:tblW w:w="0" w:type="auto"/>
+        <w:tblLook w:val="04A0" w:firstRow="1" w:lastRow="0" w:firstColumn="1" w:lastColumn="0" w:noHBand="0" w:noVBand="1"/>
+      </w:tblPr>
+      <w:tblGrid>
+        <w:gridCol w:w="2102"/>
+        <w:gridCol w:w="1302"/>
+        <w:gridCol w:w="5424"/>
+      </w:tblGrid>
+      <w:tr>
+        <w:trPr>
+          <w:cnfStyle w:val="100000000000" w:firstRow="1" w:lastRow="0" w:firstColumn="0" w:lastColumn="0" w:oddVBand="0" w:evenVBand="0" w:oddHBand="0" w:evenHBand="0" w:firstRowFirstColumn="0" w:firstRowLastColumn="0" w:lastRowFirstColumn="0" w:lastRowLastColumn="0"/>
+        </w:trPr>
+        <w:tc>
+          <w:tcPr>
+            <w:cnfStyle w:val="001000000000" w:firstRow="0" w:lastRow="0" w:firstColumn="1" w:lastColumn="0" w:oddVBand="0" w:evenVBand="0" w:oddHBand="0" w:evenHBand="0" w:firstRowFirstColumn="0" w:firstRowLastColumn="0" w:lastRowFirstColumn="0" w:lastRowLastColumn="0"/>
+            <w:tcW w:w="0" w:type="auto"/>
+            <w:hideMark/>
+          </w:tcPr>
+          <w:p>
+            <w:pPr>
+              <w:spacing w:after="160" w:line="278" w:lineRule="auto"/>
+            </w:pPr>
+            <w:r>
+              <w:t>Sección</w:t>
+            </w:r>
+          </w:p>
+        </w:tc>
+        <w:tc>
+          <w:tcPr>
+            <w:tcW w:w="0" w:type="auto"/>
+            <w:hideMark/>
+          </w:tcPr>
+          <w:p>
+            <w:pPr>
+              <w:spacing w:after="160" w:line="278" w:lineRule="auto"/>
+              <w:cnfStyle w:val="100000000000" w:firstRow="1" w:lastRow="0" w:firstColumn="0" w:lastColumn="0" w:oddVBand="0" w:evenVBand="0" w:oddHBand="0" w:evenHBand="0" w:firstRowFirstColumn="0" w:firstRowLastColumn="0" w:lastRowFirstColumn="0" w:lastRowLastColumn="0"/>
+            </w:pPr>
+            <w:r>
+              <w:t>Estado</w:t>
+            </w:r>
+          </w:p>
+        </w:tc>
+        <w:tc>
+          <w:tcPr>
+            <w:tcW w:w="0" w:type="auto"/>
+            <w:hideMark/>
+          </w:tcPr>
+          <w:p>
+            <w:pPr>
+              <w:spacing w:after="160" w:line="278" w:lineRule="auto"/>
+              <w:cnfStyle w:val="100000000000" w:firstRow="1" w:lastRow="0" w:firstColumn="0" w:lastColumn="0" w:oddVBand="0" w:evenVBand="0" w:oddHBand="0" w:evenHBand="0" w:firstRowFirstColumn="0" w:firstRowLastColumn="0" w:lastRowFirstColumn="0" w:lastRowLastColumn="0"/>
+            </w:pPr>
+            <w:r>
+              <w:t>Qué hay / qué falta</w:t>
+            </w:r>
+          </w:p>
+        </w:tc>
+      </w:tr>
+      <w:tr>
+        <w:trPr>
+          <w:cnfStyle w:val="000000100000" w:firstRow="0" w:lastRow="0" w:firstColumn="0" w:lastColumn="0" w:oddVBand="0" w:evenVBand="0" w:oddHBand="1" w:evenHBand="0" w:firstRowFirstColumn="0" w:firstRowLastColumn="0" w:lastRowFirstColumn="0" w:lastRowLastColumn="0"/>
+        </w:trPr>
+        <w:tc>
+          <w:tcPr>
+            <w:cnfStyle w:val="001000000000" w:firstRow="0" w:lastRow="0" w:firstColumn="1" w:lastColumn="0" w:oddVBand="0" w:evenVBand="0" w:oddHBand="0" w:evenHBand="0" w:firstRowFirstColumn="0" w:firstRowLastColumn="0" w:lastRowFirstColumn="0" w:lastRowLastColumn="0"/>
+            <w:tcW w:w="0" w:type="auto"/>
+            <w:hideMark/>
+          </w:tcPr>
+          <w:p>
+            <w:pPr>
+              <w:spacing w:after="160" w:line="278" w:lineRule="auto"/>
+            </w:pPr>
+            <w:r>
+              <w:t>3.1 Descripción y diagnóstico</w:t>
+            </w:r>
+          </w:p>
+        </w:tc>
+        <w:tc>
+          <w:tcPr>
+            <w:tcW w:w="0" w:type="auto"/>
+            <w:hideMark/>
+          </w:tcPr>
+          <w:p>
+            <w:pPr>
+              <w:spacing w:after="160" w:line="278" w:lineRule="auto"/>
+              <w:cnfStyle w:val="000000100000" w:firstRow="0" w:lastRow="0" w:firstColumn="0" w:lastColumn="0" w:oddVBand="0" w:evenVBand="0" w:oddHBand="1" w:evenHBand="0" w:firstRowFirstColumn="0" w:firstRowLastColumn="0" w:lastRowFirstColumn="0" w:lastRowLastColumn="0"/>
+            </w:pPr>
+            <w:r>
+              <w:rPr>
+                <w:rFonts w:ascii="Segoe UI Emoji" w:hAnsi="Segoe UI Emoji" w:cs="Segoe UI Emoji"/>
+              </w:rPr>
+              <w:t>🟡</w:t>
+            </w:r>
+            <w:r>
+              <w:t xml:space="preserve"> A medias</w:t>
+            </w:r>
+          </w:p>
+        </w:tc>
+        <w:tc>
+          <w:tcPr>
+            <w:tcW w:w="0" w:type="auto"/>
+            <w:hideMark/>
+          </w:tcPr>
+          <w:p>
+            <w:pPr>
+              <w:spacing w:after="160" w:line="278" w:lineRule="auto"/>
+              <w:cnfStyle w:val="000000100000" w:firstRow="0" w:lastRow="0" w:firstColumn="0" w:lastColumn="0" w:oddVBand="0" w:evenVBand="0" w:oddHBand="1" w:evenHBand="0" w:firstRowFirstColumn="0" w:firstRowLastColumn="0" w:lastRowFirstColumn="0" w:lastRowLastColumn="0"/>
+            </w:pPr>
+            <w:r>
+              <w:t xml:space="preserve">Ya están identificados los 5 </w:t>
+            </w:r>
+            <w:proofErr w:type="spellStart"/>
+            <w:r>
+              <w:t>code</w:t>
+            </w:r>
+            <w:proofErr w:type="spellEnd"/>
+            <w:r>
+              <w:t xml:space="preserve"> </w:t>
+            </w:r>
+            <w:proofErr w:type="spellStart"/>
+            <w:r>
+              <w:t>smells</w:t>
+            </w:r>
+            <w:proofErr w:type="spellEnd"/>
+            <w:r>
+              <w:t xml:space="preserve"> y tienes capturas. </w:t>
+            </w:r>
+            <w:r>
+              <w:rPr>
+                <w:b/>
+                <w:bCs/>
+              </w:rPr>
+              <w:t>Falta</w:t>
+            </w:r>
+            <w:r>
+              <w:t xml:space="preserve"> redactar la descripción (propósito, tecnologías, módulos) y hacer el </w:t>
+            </w:r>
+            <w:r>
+              <w:rPr>
+                <w:b/>
+                <w:bCs/>
+              </w:rPr>
+              <w:t>diagrama</w:t>
+            </w:r>
+            <w:r>
+              <w:t xml:space="preserve"> de funcionamiento.</w:t>
+            </w:r>
+          </w:p>
+        </w:tc>
+      </w:tr>
+      <w:tr>
+        <w:tc>
+          <w:tcPr>
+            <w:cnfStyle w:val="001000000000" w:firstRow="0" w:lastRow="0" w:firstColumn="1" w:lastColumn="0" w:oddVBand="0" w:evenVBand="0" w:oddHBand="0" w:evenHBand="0" w:firstRowFirstColumn="0" w:firstRowLastColumn="0" w:lastRowFirstColumn="0" w:lastRowLastColumn="0"/>
+            <w:tcW w:w="0" w:type="auto"/>
+            <w:hideMark/>
+          </w:tcPr>
+          <w:p>
+            <w:pPr>
+              <w:spacing w:after="160" w:line="278" w:lineRule="auto"/>
+            </w:pPr>
+            <w:r>
+              <w:t>3.2 Plan de mantenimiento</w:t>
+            </w:r>
+          </w:p>
+        </w:tc>
+        <w:tc>
+          <w:tcPr>
+            <w:tcW w:w="0" w:type="auto"/>
+            <w:hideMark/>
+          </w:tcPr>
+          <w:p>
+            <w:pPr>
+              <w:spacing w:after="160" w:line="278" w:lineRule="auto"/>
+              <w:cnfStyle w:val="000000000000" w:firstRow="0" w:lastRow="0" w:firstColumn="0" w:lastColumn="0" w:oddVBand="0" w:evenVBand="0" w:oddHBand="0" w:evenHBand="0" w:firstRowFirstColumn="0" w:firstRowLastColumn="0" w:lastRowFirstColumn="0" w:lastRowLastColumn="0"/>
+            </w:pPr>
+            <w:r>
+              <w:rPr>
+                <w:rFonts w:ascii="Segoe UI Emoji" w:hAnsi="Segoe UI Emoji" w:cs="Segoe UI Emoji"/>
+              </w:rPr>
+              <w:t>🔴</w:t>
+            </w:r>
+            <w:r>
+              <w:t xml:space="preserve"> Pendiente</w:t>
+            </w:r>
+          </w:p>
+        </w:tc>
+        <w:tc>
+          <w:tcPr>
+            <w:tcW w:w="0" w:type="auto"/>
+            <w:hideMark/>
+          </w:tcPr>
+          <w:p>
+            <w:pPr>
+              <w:spacing w:after="160" w:line="278" w:lineRule="auto"/>
+              <w:cnfStyle w:val="000000000000" w:firstRow="0" w:lastRow="0" w:firstColumn="0" w:lastColumn="0" w:oddVBand="0" w:evenVBand="0" w:oddHBand="0" w:evenHBand="0" w:firstRowFirstColumn="0" w:firstRowLastColumn="0" w:lastRowFirstColumn="0" w:lastRowLastColumn="0"/>
+            </w:pPr>
+            <w:r>
+              <w:t>Hay que definir las 2 acciones con problema, tipo, acción, beneficio, riesgo y verificación.</w:t>
+            </w:r>
+          </w:p>
+        </w:tc>
+      </w:tr>
+      <w:tr>
+        <w:trPr>
+          <w:cnfStyle w:val="000000100000" w:firstRow="0" w:lastRow="0" w:firstColumn="0" w:lastColumn="0" w:oddVBand="0" w:evenVBand="0" w:oddHBand="1" w:evenHBand="0" w:firstRowFirstColumn="0" w:firstRowLastColumn="0" w:lastRowFirstColumn="0" w:lastRowLastColumn="0"/>
+        </w:trPr>
+        <w:tc>
+          <w:tcPr>
+            <w:cnfStyle w:val="001000000000" w:firstRow="0" w:lastRow="0" w:firstColumn="1" w:lastColumn="0" w:oddVBand="0" w:evenVBand="0" w:oddHBand="0" w:evenHBand="0" w:firstRowFirstColumn="0" w:firstRowLastColumn="0" w:lastRowFirstColumn="0" w:lastRowLastColumn="0"/>
+            <w:tcW w:w="0" w:type="auto"/>
+            <w:hideMark/>
+          </w:tcPr>
+          <w:p>
+            <w:pPr>
+              <w:spacing w:after="160" w:line="278" w:lineRule="auto"/>
+            </w:pPr>
+            <w:r>
+              <w:t>3.3 Refactorización</w:t>
+            </w:r>
+          </w:p>
+        </w:tc>
+        <w:tc>
+          <w:tcPr>
+            <w:tcW w:w="0" w:type="auto"/>
+            <w:hideMark/>
+          </w:tcPr>
+          <w:p>
+            <w:pPr>
+              <w:spacing w:after="160" w:line="278" w:lineRule="auto"/>
+              <w:cnfStyle w:val="000000100000" w:firstRow="0" w:lastRow="0" w:firstColumn="0" w:lastColumn="0" w:oddVBand="0" w:evenVBand="0" w:oddHBand="1" w:evenHBand="0" w:firstRowFirstColumn="0" w:firstRowLastColumn="0" w:lastRowFirstColumn="0" w:lastRowLastColumn="0"/>
+            </w:pPr>
+            <w:r>
+              <w:rPr>
+                <w:rFonts w:ascii="Segoe UI Emoji" w:hAnsi="Segoe UI Emoji" w:cs="Segoe UI Emoji"/>
+              </w:rPr>
+              <w:t>🔴</w:t>
+            </w:r>
+            <w:r>
+              <w:t xml:space="preserve"> Pendiente</w:t>
+            </w:r>
+          </w:p>
+        </w:tc>
+        <w:tc>
+          <w:tcPr>
+            <w:tcW w:w="0" w:type="auto"/>
+            <w:hideMark/>
+          </w:tcPr>
+          <w:p>
+            <w:pPr>
+              <w:spacing w:after="160" w:line="278" w:lineRule="auto"/>
+              <w:cnfStyle w:val="000000100000" w:firstRow="0" w:lastRow="0" w:firstColumn="0" w:lastColumn="0" w:oddVBand="0" w:evenVBand="0" w:oddHBand="1" w:evenHBand="0" w:firstRowFirstColumn="0" w:firstRowLastColumn="0" w:lastRowFirstColumn="0" w:lastRowLastColumn="0"/>
+            </w:pPr>
+            <w:r>
+              <w:t>El "antes" ya existe; falta hacer el "después".</w:t>
+            </w:r>
+          </w:p>
+        </w:tc>
+      </w:tr>
+      <w:tr>
+        <w:tc>
+          <w:tcPr>
+            <w:cnfStyle w:val="001000000000" w:firstRow="0" w:lastRow="0" w:firstColumn="1" w:lastColumn="0" w:oddVBand="0" w:evenVBand="0" w:oddHBand="0" w:evenHBand="0" w:firstRowFirstColumn="0" w:firstRowLastColumn="0" w:lastRowFirstColumn="0" w:lastRowLastColumn="0"/>
+            <w:tcW w:w="0" w:type="auto"/>
+            <w:hideMark/>
+          </w:tcPr>
+          <w:p>
+            <w:pPr>
+              <w:spacing w:after="160" w:line="278" w:lineRule="auto"/>
+            </w:pPr>
+            <w:r>
+              <w:t>3.4 Gestión de cambios</w:t>
+            </w:r>
+          </w:p>
+        </w:tc>
+        <w:tc>
+          <w:tcPr>
+            <w:tcW w:w="0" w:type="auto"/>
+            <w:hideMark/>
+          </w:tcPr>
+          <w:p>
+            <w:pPr>
+              <w:spacing w:after="160" w:line="278" w:lineRule="auto"/>
+              <w:cnfStyle w:val="000000000000" w:firstRow="0" w:lastRow="0" w:firstColumn="0" w:lastColumn="0" w:oddVBand="0" w:evenVBand="0" w:oddHBand="0" w:evenHBand="0" w:firstRowFirstColumn="0" w:firstRowLastColumn="0" w:lastRowFirstColumn="0" w:lastRowLastColumn="0"/>
+            </w:pPr>
+            <w:r>
+              <w:rPr>
+                <w:rFonts w:ascii="Segoe UI Emoji" w:hAnsi="Segoe UI Emoji" w:cs="Segoe UI Emoji"/>
+              </w:rPr>
+              <w:t>🔴</w:t>
+            </w:r>
+            <w:r>
+              <w:t xml:space="preserve"> Pendiente</w:t>
+            </w:r>
+          </w:p>
+        </w:tc>
+        <w:tc>
+          <w:tcPr>
+            <w:tcW w:w="0" w:type="auto"/>
+            <w:hideMark/>
+          </w:tcPr>
+          <w:p>
+            <w:pPr>
+              <w:spacing w:after="160" w:line="278" w:lineRule="auto"/>
+              <w:cnfStyle w:val="000000000000" w:firstRow="0" w:lastRow="0" w:firstColumn="0" w:lastColumn="0" w:oddVBand="0" w:evenVBand="0" w:oddHBand="0" w:evenHBand="0" w:firstRowFirstColumn="0" w:firstRowLastColumn="0" w:lastRowFirstColumn="0" w:lastRowLastColumn="0"/>
+            </w:pPr>
+            <w:r>
+              <w:t>Faltan las solicitudes CR-01 y CR-02.</w:t>
+            </w:r>
+          </w:p>
+        </w:tc>
+      </w:tr>
+      <w:tr>
+        <w:trPr>
+          <w:cnfStyle w:val="000000100000" w:firstRow="0" w:lastRow="0" w:firstColumn="0" w:lastColumn="0" w:oddVBand="0" w:evenVBand="0" w:oddHBand="1" w:evenHBand="0" w:firstRowFirstColumn="0" w:firstRowLastColumn="0" w:lastRowFirstColumn="0" w:lastRowLastColumn="0"/>
+        </w:trPr>
+        <w:tc>
+          <w:tcPr>
+            <w:cnfStyle w:val="001000000000" w:firstRow="0" w:lastRow="0" w:firstColumn="1" w:lastColumn="0" w:oddVBand="0" w:evenVBand="0" w:oddHBand="0" w:evenHBand="0" w:firstRowFirstColumn="0" w:firstRowLastColumn="0" w:lastRowFirstColumn="0" w:lastRowLastColumn="0"/>
+            <w:tcW w:w="0" w:type="auto"/>
+            <w:hideMark/>
+          </w:tcPr>
+          <w:p>
+            <w:pPr>
+              <w:spacing w:after="160" w:line="278" w:lineRule="auto"/>
+            </w:pPr>
+            <w:r>
+              <w:t xml:space="preserve">3.5 Configuración y </w:t>
+            </w:r>
+            <w:proofErr w:type="spellStart"/>
+            <w:r>
+              <w:t>baseline</w:t>
+            </w:r>
+            <w:proofErr w:type="spellEnd"/>
+          </w:p>
+        </w:tc>
+        <w:tc>
+          <w:tcPr>
+            <w:tcW w:w="0" w:type="auto"/>
+            <w:hideMark/>
+          </w:tcPr>
+          <w:p>
+            <w:pPr>
+              <w:spacing w:after="160" w:line="278" w:lineRule="auto"/>
+              <w:cnfStyle w:val="000000100000" w:firstRow="0" w:lastRow="0" w:firstColumn="0" w:lastColumn="0" w:oddVBand="0" w:evenVBand="0" w:oddHBand="1" w:evenHBand="0" w:firstRowFirstColumn="0" w:firstRowLastColumn="0" w:lastRowFirstColumn="0" w:lastRowLastColumn="0"/>
+            </w:pPr>
+            <w:r>
+              <w:rPr>
+                <w:rFonts w:ascii="Segoe UI Emoji" w:hAnsi="Segoe UI Emoji" w:cs="Segoe UI Emoji"/>
+              </w:rPr>
+              <w:t>🟡</w:t>
+            </w:r>
+            <w:r>
+              <w:t xml:space="preserve"> Iniciada</w:t>
+            </w:r>
+          </w:p>
+        </w:tc>
+        <w:tc>
+          <w:tcPr>
+            <w:tcW w:w="0" w:type="auto"/>
+            <w:hideMark/>
+          </w:tcPr>
+          <w:p>
+            <w:pPr>
+              <w:spacing w:after="160" w:line="278" w:lineRule="auto"/>
+              <w:cnfStyle w:val="000000100000" w:firstRow="0" w:lastRow="0" w:firstColumn="0" w:lastColumn="0" w:oddVBand="0" w:evenVBand="0" w:oddHBand="1" w:evenHBand="0" w:firstRowFirstColumn="0" w:firstRowLastColumn="0" w:lastRowFirstColumn="0" w:lastRowLastColumn="0"/>
+            </w:pPr>
+            <w:r>
+              <w:t xml:space="preserve">La </w:t>
+            </w:r>
+            <w:proofErr w:type="spellStart"/>
+            <w:r>
+              <w:rPr>
+                <w:b/>
+                <w:bCs/>
+              </w:rPr>
+              <w:t>baseline</w:t>
+            </w:r>
+            <w:proofErr w:type="spellEnd"/>
+            <w:r>
+              <w:rPr>
+                <w:b/>
+                <w:bCs/>
+              </w:rPr>
+              <w:t xml:space="preserve"> inicial</w:t>
+            </w:r>
+            <w:r>
+              <w:t xml:space="preserve"> ya está (tag v1.0-baseline-inicial) y </w:t>
+            </w:r>
+            <w:proofErr w:type="gramStart"/>
+            <w:r>
+              <w:t>tienes .</w:t>
+            </w:r>
+            <w:proofErr w:type="spellStart"/>
+            <w:r>
+              <w:t>gitignore</w:t>
+            </w:r>
+            <w:proofErr w:type="spellEnd"/>
+            <w:proofErr w:type="gramEnd"/>
+            <w:r>
+              <w:t xml:space="preserve">. Falta la lista de artefactos y la </w:t>
+            </w:r>
+            <w:proofErr w:type="spellStart"/>
+            <w:r>
+              <w:t>baseline</w:t>
+            </w:r>
+            <w:proofErr w:type="spellEnd"/>
+            <w:r>
+              <w:t xml:space="preserve"> final.</w:t>
+            </w:r>
+          </w:p>
+        </w:tc>
+      </w:tr>
+      <w:tr>
+        <w:tc>
+          <w:tcPr>
+            <w:cnfStyle w:val="001000000000" w:firstRow="0" w:lastRow="0" w:firstColumn="1" w:lastColumn="0" w:oddVBand="0" w:evenVBand="0" w:oddHBand="0" w:evenHBand="0" w:firstRowFirstColumn="0" w:firstRowLastColumn="0" w:lastRowFirstColumn="0" w:lastRowLastColumn="0"/>
+            <w:tcW w:w="0" w:type="auto"/>
+            <w:hideMark/>
+          </w:tcPr>
+          <w:p>
+            <w:pPr>
+              <w:spacing w:after="160" w:line="278" w:lineRule="auto"/>
+            </w:pPr>
+            <w:r>
+              <w:t>3.6 Versiones con Git</w:t>
+            </w:r>
+          </w:p>
+        </w:tc>
+        <w:tc>
+          <w:tcPr>
+            <w:tcW w:w="0" w:type="auto"/>
+            <w:hideMark/>
+          </w:tcPr>
+          <w:p>
+            <w:pPr>
+              <w:spacing w:after="160" w:line="278" w:lineRule="auto"/>
+              <w:cnfStyle w:val="000000000000" w:firstRow="0" w:lastRow="0" w:firstColumn="0" w:lastColumn="0" w:oddVBand="0" w:evenVBand="0" w:oddHBand="0" w:evenHBand="0" w:firstRowFirstColumn="0" w:firstRowLastColumn="0" w:lastRowFirstColumn="0" w:lastRowLastColumn="0"/>
+            </w:pPr>
+            <w:r>
+              <w:rPr>
+                <w:rFonts w:ascii="Segoe UI Emoji" w:hAnsi="Segoe UI Emoji" w:cs="Segoe UI Emoji"/>
+              </w:rPr>
+              <w:t>🟡</w:t>
+            </w:r>
+            <w:r>
+              <w:t xml:space="preserve"> Iniciada</w:t>
+            </w:r>
+          </w:p>
+        </w:tc>
+        <w:tc>
+          <w:tcPr>
+            <w:tcW w:w="0" w:type="auto"/>
+            <w:hideMark/>
+          </w:tcPr>
+          <w:p>
+            <w:pPr>
+              <w:spacing w:after="160" w:line="278" w:lineRule="auto"/>
+              <w:cnfStyle w:val="000000000000" w:firstRow="0" w:lastRow="0" w:firstColumn="0" w:lastColumn="0" w:oddVBand="0" w:evenVBand="0" w:oddHBand="0" w:evenHBand="0" w:firstRowFirstColumn="0" w:firstRowLastColumn="0" w:lastRowFirstColumn="0" w:lastRowLastColumn="0"/>
+            </w:pPr>
+            <w:r>
+              <w:t xml:space="preserve">Ya hay historial de </w:t>
+            </w:r>
+            <w:proofErr w:type="spellStart"/>
+            <w:r>
+              <w:t>commits</w:t>
+            </w:r>
+            <w:proofErr w:type="spellEnd"/>
+            <w:r>
+              <w:t xml:space="preserve"> y el tag inicial. Faltan la rama de trabajo, el </w:t>
+            </w:r>
+            <w:proofErr w:type="spellStart"/>
+            <w:r>
+              <w:t>merge</w:t>
+            </w:r>
+            <w:proofErr w:type="spellEnd"/>
+            <w:r>
+              <w:t xml:space="preserve"> y el tag final v2.0.</w:t>
+            </w:r>
+          </w:p>
+        </w:tc>
+      </w:tr>
+      <w:tr>
+        <w:trPr>
+          <w:cnfStyle w:val="000000100000" w:firstRow="0" w:lastRow="0" w:firstColumn="0" w:lastColumn="0" w:oddVBand="0" w:evenVBand="0" w:oddHBand="1" w:evenHBand="0" w:firstRowFirstColumn="0" w:firstRowLastColumn="0" w:lastRowFirstColumn="0" w:lastRowLastColumn="0"/>
+        </w:trPr>
+        <w:tc>
+          <w:tcPr>
+            <w:cnfStyle w:val="001000000000" w:firstRow="0" w:lastRow="0" w:firstColumn="1" w:lastColumn="0" w:oddVBand="0" w:evenVBand="0" w:oddHBand="0" w:evenHBand="0" w:firstRowFirstColumn="0" w:firstRowLastColumn="0" w:lastRowFirstColumn="0" w:lastRowLastColumn="0"/>
+            <w:tcW w:w="0" w:type="auto"/>
+            <w:hideMark/>
+          </w:tcPr>
+          <w:p>
+            <w:pPr>
+              <w:spacing w:after="160" w:line="278" w:lineRule="auto"/>
+            </w:pPr>
+            <w:r>
+              <w:t>3.7 Participación del equipo</w:t>
+            </w:r>
+          </w:p>
+        </w:tc>
+        <w:tc>
+          <w:tcPr>
+            <w:tcW w:w="0" w:type="auto"/>
+            <w:hideMark/>
+          </w:tcPr>
+          <w:p>
+            <w:pPr>
+              <w:spacing w:after="160" w:line="278" w:lineRule="auto"/>
+              <w:cnfStyle w:val="000000100000" w:firstRow="0" w:lastRow="0" w:firstColumn="0" w:lastColumn="0" w:oddVBand="0" w:evenVBand="0" w:oddHBand="1" w:evenHBand="0" w:firstRowFirstColumn="0" w:firstRowLastColumn="0" w:lastRowFirstColumn="0" w:lastRowLastColumn="0"/>
+            </w:pPr>
+            <w:r>
+              <w:rPr>
+                <w:rFonts w:ascii="Segoe UI Emoji" w:hAnsi="Segoe UI Emoji" w:cs="Segoe UI Emoji"/>
+              </w:rPr>
+              <w:t>🔴</w:t>
+            </w:r>
+            <w:r>
+              <w:t xml:space="preserve"> Pendiente</w:t>
+            </w:r>
+          </w:p>
+        </w:tc>
+        <w:tc>
+          <w:tcPr>
+            <w:tcW w:w="0" w:type="auto"/>
+            <w:hideMark/>
+          </w:tcPr>
+          <w:p>
+            <w:pPr>
+              <w:spacing w:after="160" w:line="278" w:lineRule="auto"/>
+              <w:cnfStyle w:val="000000100000" w:firstRow="0" w:lastRow="0" w:firstColumn="0" w:lastColumn="0" w:oddVBand="0" w:evenVBand="0" w:oddHBand="1" w:evenHBand="0" w:firstRowFirstColumn="0" w:firstRowLastColumn="0" w:lastRowFirstColumn="0" w:lastRowLastColumn="0"/>
+            </w:pPr>
+            <w:r>
+              <w:t xml:space="preserve">Por ahora </w:t>
+            </w:r>
+            <w:r>
+              <w:rPr>
+                <w:b/>
+                <w:bCs/>
+              </w:rPr>
+              <w:t xml:space="preserve">todos los </w:t>
+            </w:r>
+            <w:proofErr w:type="spellStart"/>
+            <w:r>
+              <w:rPr>
+                <w:b/>
+                <w:bCs/>
+              </w:rPr>
+              <w:t>commits</w:t>
+            </w:r>
+            <w:proofErr w:type="spellEnd"/>
+            <w:r>
+              <w:rPr>
+                <w:b/>
+                <w:bCs/>
+              </w:rPr>
+              <w:t xml:space="preserve"> son tuyos</w:t>
+            </w:r>
+            <w:r>
+              <w:t xml:space="preserve"> (</w:t>
+            </w:r>
+            <w:proofErr w:type="spellStart"/>
+            <w:r>
+              <w:t>DrawRay</w:t>
+            </w:r>
+            <w:proofErr w:type="spellEnd"/>
+            <w:r>
+              <w:t>).</w:t>
+            </w:r>
+          </w:p>
+        </w:tc>
+      </w:tr>
+      <w:tr>
+        <w:tc>
+          <w:tcPr>
+            <w:cnfStyle w:val="001000000000" w:firstRow="0" w:lastRow="0" w:firstColumn="1" w:lastColumn="0" w:oddVBand="0" w:evenVBand="0" w:oddHBand="0" w:evenHBand="0" w:firstRowFirstColumn="0" w:firstRowLastColumn="0" w:lastRowFirstColumn="0" w:lastRowLastColumn="0"/>
+            <w:tcW w:w="0" w:type="auto"/>
+            <w:hideMark/>
+          </w:tcPr>
+          <w:p>
+            <w:pPr>
+              <w:spacing w:after="160" w:line="278" w:lineRule="auto"/>
+            </w:pPr>
+            <w:r>
+              <w:t>3.8 Uso de IA</w:t>
+            </w:r>
+          </w:p>
+        </w:tc>
+        <w:tc>
+          <w:tcPr>
+            <w:tcW w:w="0" w:type="auto"/>
+            <w:hideMark/>
+          </w:tcPr>
+          <w:p>
+            <w:pPr>
+              <w:spacing w:after="160" w:line="278" w:lineRule="auto"/>
+              <w:cnfStyle w:val="000000000000" w:firstRow="0" w:lastRow="0" w:firstColumn="0" w:lastColumn="0" w:oddVBand="0" w:evenVBand="0" w:oddHBand="0" w:evenHBand="0" w:firstRowFirstColumn="0" w:firstRowLastColumn="0" w:lastRowFirstColumn="0" w:lastRowLastColumn="0"/>
+            </w:pPr>
+            <w:r>
+              <w:rPr>
+                <w:rFonts w:ascii="Segoe UI Emoji" w:hAnsi="Segoe UI Emoji" w:cs="Segoe UI Emoji"/>
+              </w:rPr>
+              <w:t>🔴</w:t>
+            </w:r>
+            <w:r>
+              <w:t xml:space="preserve"> Pendiente</w:t>
+            </w:r>
+          </w:p>
+        </w:tc>
+        <w:tc>
+          <w:tcPr>
+            <w:tcW w:w="0" w:type="auto"/>
+            <w:hideMark/>
+          </w:tcPr>
+          <w:p>
+            <w:pPr>
+              <w:spacing w:after="160" w:line="278" w:lineRule="auto"/>
+              <w:cnfStyle w:val="000000000000" w:firstRow="0" w:lastRow="0" w:firstColumn="0" w:lastColumn="0" w:oddVBand="0" w:evenVBand="0" w:oddHBand="0" w:evenHBand="0" w:firstRowFirstColumn="0" w:firstRowLastColumn="0" w:lastRowFirstColumn="0" w:lastRowLastColumn="0"/>
+            </w:pPr>
+            <w:r>
+              <w:t>Solo falta redactarlo al final: que la v1 y el apoyo en el diagnóstico se hicieron con IA, y qué validaron ustedes.</w:t>
+            </w:r>
+          </w:p>
+        </w:tc>
+      </w:tr>
+    </w:tbl>
+    <w:p/>
+    <w:p/>
+    <w:p/>
+    <w:p/>
+    <w:p/>
+    <w:p/>
+    <w:p/>
+    <w:p/>
+    <w:p/>
+    <w:p/>
+    <w:p/>
+    <w:p>
+      <w:pPr>
+        <w:rPr>
+          <w:b/>
+          <w:bCs/>
+        </w:rPr>
+      </w:pPr>
+      <w:r>
+        <w:rPr>
+          <w:b/>
+          <w:bCs/>
+        </w:rPr>
+        <w:lastRenderedPageBreak/>
+        <w:t>1. Descripción de la aplicación</w:t>
+      </w:r>
+    </w:p>
+    <w:p>
+      <w:r>
+        <w:rPr>
+          <w:b/>
+          <w:bCs/>
+        </w:rPr>
+        <w:t>Propósito.</w:t>
+      </w:r>
+      <w:r>
+        <w:t xml:space="preserve"> </w:t>
+      </w:r>
+      <w:proofErr w:type="spellStart"/>
+      <w:r>
+        <w:t>NotaFácil</w:t>
+      </w:r>
+      <w:proofErr w:type="spellEnd"/>
+      <w:r>
+        <w:t xml:space="preserve"> es una aplicación web que permite a un docente registrar a los estudiantes de un curso con sus notas de evaluación, calcular automáticamente su promedio ponderado y conocer su situación académica. Su objetivo es reemplazar el registro manual en hojas de cálculo por una herramienta sencilla que evita errores de cálculo y muestra un resumen inmediato del rendimiento del aula.</w:t>
+      </w:r>
+    </w:p>
+    <w:p>
+      <w:r>
+        <w:rPr>
+          <w:b/>
+          <w:bCs/>
+        </w:rPr>
+        <w:t>Tecnologías.</w:t>
+      </w:r>
+      <w:r>
+        <w:t xml:space="preserve"> La aplicación está desarrollada con </w:t>
+      </w:r>
+      <w:proofErr w:type="spellStart"/>
+      <w:r>
+        <w:t>React</w:t>
+      </w:r>
+      <w:proofErr w:type="spellEnd"/>
+      <w:r>
+        <w:t xml:space="preserve"> 18 como biblioteca de interfaz y Vite 5 como herramienta de construcción y servidor de desarrollo. Los datos se guardan en el </w:t>
+      </w:r>
+      <w:proofErr w:type="spellStart"/>
+      <w:r>
+        <w:t>localStorage</w:t>
+      </w:r>
+      <w:proofErr w:type="spellEnd"/>
+      <w:r>
+        <w:t xml:space="preserve"> del navegador, por lo que no requiere servidor ni base de datos externa. El código se gestiona con Git y está alojado en GitHub.</w:t>
+      </w:r>
+    </w:p>
+    <w:p>
+      <w:r>
+        <w:rPr>
+          <w:b/>
+          <w:bCs/>
+        </w:rPr>
+        <w:t>Principales módulos o componentes.</w:t>
+      </w:r>
+      <w:r>
+        <w:t xml:space="preserve"> En su versión inicial (v1.0), la aplicación ofrece las siguientes funcionalidades:</w:t>
+      </w:r>
+    </w:p>
+    <w:tbl>
+      <w:tblPr>
+        <w:tblStyle w:val="Tablanormal1"/>
+        <w:tblW w:w="0" w:type="auto"/>
+        <w:tblLook w:val="04A0" w:firstRow="1" w:lastRow="0" w:firstColumn="1" w:lastColumn="0" w:noHBand="0" w:noVBand="1"/>
+      </w:tblPr>
+      <w:tblGrid>
+        <w:gridCol w:w="2131"/>
+        <w:gridCol w:w="6697"/>
+      </w:tblGrid>
+      <w:tr>
+        <w:trPr>
+          <w:cnfStyle w:val="100000000000" w:firstRow="1" w:lastRow="0" w:firstColumn="0" w:lastColumn="0" w:oddVBand="0" w:evenVBand="0" w:oddHBand="0" w:evenHBand="0" w:firstRowFirstColumn="0" w:firstRowLastColumn="0" w:lastRowFirstColumn="0" w:lastRowLastColumn="0"/>
+        </w:trPr>
+        <w:tc>
+          <w:tcPr>
+            <w:cnfStyle w:val="001000000000" w:firstRow="0" w:lastRow="0" w:firstColumn="1" w:lastColumn="0" w:oddVBand="0" w:evenVBand="0" w:oddHBand="0" w:evenHBand="0" w:firstRowFirstColumn="0" w:firstRowLastColumn="0" w:lastRowFirstColumn="0" w:lastRowLastColumn="0"/>
+            <w:tcW w:w="0" w:type="auto"/>
+            <w:hideMark/>
+          </w:tcPr>
+          <w:p>
+            <w:pPr>
+              <w:spacing w:after="160" w:line="278" w:lineRule="auto"/>
+            </w:pPr>
+            <w:r>
+              <w:t>Módulo</w:t>
+            </w:r>
+          </w:p>
+        </w:tc>
+        <w:tc>
+          <w:tcPr>
+            <w:tcW w:w="0" w:type="auto"/>
+            <w:hideMark/>
+          </w:tcPr>
+          <w:p>
+            <w:pPr>
+              <w:spacing w:after="160" w:line="278" w:lineRule="auto"/>
+              <w:cnfStyle w:val="100000000000" w:firstRow="1" w:lastRow="0" w:firstColumn="0" w:lastColumn="0" w:oddVBand="0" w:evenVBand="0" w:oddHBand="0" w:evenHBand="0" w:firstRowFirstColumn="0" w:firstRowLastColumn="0" w:lastRowFirstColumn="0" w:lastRowLastColumn="0"/>
+            </w:pPr>
+            <w:r>
+              <w:t>Responsabilidad</w:t>
+            </w:r>
+          </w:p>
+        </w:tc>
+      </w:tr>
+      <w:tr>
+        <w:trPr>
+          <w:cnfStyle w:val="000000100000" w:firstRow="0" w:lastRow="0" w:firstColumn="0" w:lastColumn="0" w:oddVBand="0" w:evenVBand="0" w:oddHBand="1" w:evenHBand="0" w:firstRowFirstColumn="0" w:firstRowLastColumn="0" w:lastRowFirstColumn="0" w:lastRowLastColumn="0"/>
+        </w:trPr>
+        <w:tc>
+          <w:tcPr>
+            <w:cnfStyle w:val="001000000000" w:firstRow="0" w:lastRow="0" w:firstColumn="1" w:lastColumn="0" w:oddVBand="0" w:evenVBand="0" w:oddHBand="0" w:evenHBand="0" w:firstRowFirstColumn="0" w:firstRowLastColumn="0" w:lastRowFirstColumn="0" w:lastRowLastColumn="0"/>
+            <w:tcW w:w="0" w:type="auto"/>
+            <w:hideMark/>
+          </w:tcPr>
+          <w:p>
+            <w:pPr>
+              <w:spacing w:after="160" w:line="278" w:lineRule="auto"/>
+            </w:pPr>
+            <w:r>
+              <w:t>Registro y edición</w:t>
+            </w:r>
+          </w:p>
+        </w:tc>
+        <w:tc>
+          <w:tcPr>
+            <w:tcW w:w="0" w:type="auto"/>
+            <w:hideMark/>
+          </w:tcPr>
+          <w:p>
+            <w:pPr>
+              <w:spacing w:after="160" w:line="278" w:lineRule="auto"/>
+              <w:cnfStyle w:val="000000100000" w:firstRow="0" w:lastRow="0" w:firstColumn="0" w:lastColumn="0" w:oddVBand="0" w:evenVBand="0" w:oddHBand="1" w:evenHBand="0" w:firstRowFirstColumn="0" w:firstRowLastColumn="0" w:lastRowFirstColumn="0" w:lastRowLastColumn="0"/>
+            </w:pPr>
+            <w:r>
+              <w:t>Formulario para ingresar código, nombre y tres notas (T1, parcial y final).</w:t>
+            </w:r>
+          </w:p>
+        </w:tc>
+      </w:tr>
+      <w:tr>
+        <w:tc>
+          <w:tcPr>
+            <w:cnfStyle w:val="001000000000" w:firstRow="0" w:lastRow="0" w:firstColumn="1" w:lastColumn="0" w:oddVBand="0" w:evenVBand="0" w:oddHBand="0" w:evenHBand="0" w:firstRowFirstColumn="0" w:firstRowLastColumn="0" w:lastRowFirstColumn="0" w:lastRowLastColumn="0"/>
+            <w:tcW w:w="0" w:type="auto"/>
+            <w:hideMark/>
+          </w:tcPr>
+          <w:p>
+            <w:pPr>
+              <w:spacing w:after="160" w:line="278" w:lineRule="auto"/>
+            </w:pPr>
+            <w:r>
+              <w:t>Validación</w:t>
+            </w:r>
+          </w:p>
+        </w:tc>
+        <w:tc>
+          <w:tcPr>
+            <w:tcW w:w="0" w:type="auto"/>
+            <w:hideMark/>
+          </w:tcPr>
+          <w:p>
+            <w:pPr>
+              <w:spacing w:after="160" w:line="278" w:lineRule="auto"/>
+              <w:cnfStyle w:val="000000000000" w:firstRow="0" w:lastRow="0" w:firstColumn="0" w:lastColumn="0" w:oddVBand="0" w:evenVBand="0" w:oddHBand="0" w:evenHBand="0" w:firstRowFirstColumn="0" w:firstRowLastColumn="0" w:lastRowFirstColumn="0" w:lastRowLastColumn="0"/>
+            </w:pPr>
+            <w:r>
+              <w:t>Verifica campos obligatorios, notas entre 0 y 20 y que el código no se repita.</w:t>
+            </w:r>
+          </w:p>
+        </w:tc>
+      </w:tr>
+      <w:tr>
+        <w:trPr>
+          <w:cnfStyle w:val="000000100000" w:firstRow="0" w:lastRow="0" w:firstColumn="0" w:lastColumn="0" w:oddVBand="0" w:evenVBand="0" w:oddHBand="1" w:evenHBand="0" w:firstRowFirstColumn="0" w:firstRowLastColumn="0" w:lastRowFirstColumn="0" w:lastRowLastColumn="0"/>
+        </w:trPr>
+        <w:tc>
+          <w:tcPr>
+            <w:cnfStyle w:val="001000000000" w:firstRow="0" w:lastRow="0" w:firstColumn="1" w:lastColumn="0" w:oddVBand="0" w:evenVBand="0" w:oddHBand="0" w:evenHBand="0" w:firstRowFirstColumn="0" w:firstRowLastColumn="0" w:lastRowFirstColumn="0" w:lastRowLastColumn="0"/>
+            <w:tcW w:w="0" w:type="auto"/>
+            <w:hideMark/>
+          </w:tcPr>
+          <w:p>
+            <w:pPr>
+              <w:spacing w:after="160" w:line="278" w:lineRule="auto"/>
+            </w:pPr>
+            <w:r>
+              <w:t>Cálculo de promedio y estado</w:t>
+            </w:r>
+          </w:p>
+        </w:tc>
+        <w:tc>
+          <w:tcPr>
+            <w:tcW w:w="0" w:type="auto"/>
+            <w:hideMark/>
+          </w:tcPr>
+          <w:p>
+            <w:pPr>
+              <w:spacing w:after="160" w:line="278" w:lineRule="auto"/>
+              <w:cnfStyle w:val="000000100000" w:firstRow="0" w:lastRow="0" w:firstColumn="0" w:lastColumn="0" w:oddVBand="0" w:evenVBand="0" w:oddHBand="1" w:evenHBand="0" w:firstRowFirstColumn="0" w:firstRowLastColumn="0" w:lastRowFirstColumn="0" w:lastRowLastColumn="0"/>
+            </w:pPr>
+            <w:r>
+              <w:t>Aplica la ponderación T1 30%, parcial 30% y final 40%, y clasifica al estudiante como Destacado (≥ 17), Aprobado (≥ 10.5) o Desaprobado.</w:t>
+            </w:r>
+          </w:p>
+        </w:tc>
+      </w:tr>
+      <w:tr>
+        <w:tc>
+          <w:tcPr>
+            <w:cnfStyle w:val="001000000000" w:firstRow="0" w:lastRow="0" w:firstColumn="1" w:lastColumn="0" w:oddVBand="0" w:evenVBand="0" w:oddHBand="0" w:evenHBand="0" w:firstRowFirstColumn="0" w:firstRowLastColumn="0" w:lastRowFirstColumn="0" w:lastRowLastColumn="0"/>
+            <w:tcW w:w="0" w:type="auto"/>
+            <w:hideMark/>
+          </w:tcPr>
+          <w:p>
+            <w:pPr>
+              <w:spacing w:after="160" w:line="278" w:lineRule="auto"/>
+            </w:pPr>
+            <w:r>
+              <w:t>Listado y búsqueda</w:t>
+            </w:r>
+          </w:p>
+        </w:tc>
+        <w:tc>
+          <w:tcPr>
+            <w:tcW w:w="0" w:type="auto"/>
+            <w:hideMark/>
+          </w:tcPr>
+          <w:p>
+            <w:pPr>
+              <w:spacing w:after="160" w:line="278" w:lineRule="auto"/>
+              <w:cnfStyle w:val="000000000000" w:firstRow="0" w:lastRow="0" w:firstColumn="0" w:lastColumn="0" w:oddVBand="0" w:evenVBand="0" w:oddHBand="0" w:evenHBand="0" w:firstRowFirstColumn="0" w:firstRowLastColumn="0" w:lastRowFirstColumn="0" w:lastRowLastColumn="0"/>
+            </w:pPr>
+            <w:r>
+              <w:t>Muestra la tabla de estudiantes y permite filtrar por nombre o código.</w:t>
+            </w:r>
+          </w:p>
+        </w:tc>
+      </w:tr>
+      <w:tr>
+        <w:trPr>
+          <w:cnfStyle w:val="000000100000" w:firstRow="0" w:lastRow="0" w:firstColumn="0" w:lastColumn="0" w:oddVBand="0" w:evenVBand="0" w:oddHBand="1" w:evenHBand="0" w:firstRowFirstColumn="0" w:firstRowLastColumn="0" w:lastRowFirstColumn="0" w:lastRowLastColumn="0"/>
+        </w:trPr>
+        <w:tc>
+          <w:tcPr>
+            <w:cnfStyle w:val="001000000000" w:firstRow="0" w:lastRow="0" w:firstColumn="1" w:lastColumn="0" w:oddVBand="0" w:evenVBand="0" w:oddHBand="0" w:evenHBand="0" w:firstRowFirstColumn="0" w:firstRowLastColumn="0" w:lastRowFirstColumn="0" w:lastRowLastColumn="0"/>
+            <w:tcW w:w="0" w:type="auto"/>
+            <w:hideMark/>
+          </w:tcPr>
+          <w:p>
+            <w:pPr>
+              <w:spacing w:after="160" w:line="278" w:lineRule="auto"/>
+            </w:pPr>
+            <w:r>
+              <w:t>Resumen del aula</w:t>
+            </w:r>
+          </w:p>
+        </w:tc>
+        <w:tc>
+          <w:tcPr>
+            <w:tcW w:w="0" w:type="auto"/>
+            <w:hideMark/>
+          </w:tcPr>
+          <w:p>
+            <w:pPr>
+              <w:spacing w:after="160" w:line="278" w:lineRule="auto"/>
+              <w:cnfStyle w:val="000000100000" w:firstRow="0" w:lastRow="0" w:firstColumn="0" w:lastColumn="0" w:oddVBand="0" w:evenVBand="0" w:oddHBand="1" w:evenHBand="0" w:firstRowFirstColumn="0" w:firstRowLastColumn="0" w:lastRowFirstColumn="0" w:lastRowLastColumn="0"/>
+            </w:pPr>
+            <w:r>
+              <w:t>Muestra el total de estudiantes, aprobados, desaprobados y el promedio general.</w:t>
+            </w:r>
+          </w:p>
+        </w:tc>
+      </w:tr>
+      <w:tr>
+        <w:tc>
+          <w:tcPr>
+            <w:cnfStyle w:val="001000000000" w:firstRow="0" w:lastRow="0" w:firstColumn="1" w:lastColumn="0" w:oddVBand="0" w:evenVBand="0" w:oddHBand="0" w:evenHBand="0" w:firstRowFirstColumn="0" w:firstRowLastColumn="0" w:lastRowFirstColumn="0" w:lastRowLastColumn="0"/>
+            <w:tcW w:w="0" w:type="auto"/>
+            <w:hideMark/>
+          </w:tcPr>
+          <w:p>
+            <w:pPr>
+              <w:spacing w:after="160" w:line="278" w:lineRule="auto"/>
+            </w:pPr>
+            <w:r>
+              <w:t>Persistencia</w:t>
+            </w:r>
+          </w:p>
+        </w:tc>
+        <w:tc>
+          <w:tcPr>
+            <w:tcW w:w="0" w:type="auto"/>
+            <w:hideMark/>
+          </w:tcPr>
+          <w:p>
+            <w:pPr>
+              <w:spacing w:after="160" w:line="278" w:lineRule="auto"/>
+              <w:cnfStyle w:val="000000000000" w:firstRow="0" w:lastRow="0" w:firstColumn="0" w:lastColumn="0" w:oddVBand="0" w:evenVBand="0" w:oddHBand="0" w:evenHBand="0" w:firstRowFirstColumn="0" w:firstRowLastColumn="0" w:lastRowFirstColumn="0" w:lastRowLastColumn="0"/>
+            </w:pPr>
+            <w:r>
+              <w:t xml:space="preserve">Guarda y recupera la lista de estudiantes en el </w:t>
+            </w:r>
+            <w:proofErr w:type="spellStart"/>
+            <w:r>
+              <w:t>localStorage</w:t>
+            </w:r>
+            <w:proofErr w:type="spellEnd"/>
+            <w:r>
+              <w:t xml:space="preserve"> del navegador.</w:t>
+            </w:r>
+          </w:p>
+        </w:tc>
+      </w:tr>
+    </w:tbl>
+    <w:p/>
+    <w:p>
+      <w:r>
+        <w:rPr>
+          <w:b/>
+          <w:bCs/>
+        </w:rPr>
+        <w:t>Funcionamiento.</w:t>
+      </w:r>
+      <w:r>
+        <w:t xml:space="preserve"> El docente ingresa los datos del estudiante en el formulario. La aplicación valida la información y, si es correcta, la agrega a la lista y la guarda en el navegador. A partir de esa lista se calcula el promedio y el estado de cada estudiante, que se muestran en la tabla, y se actualizan las estadísticas del resumen. Al volver a abrir la aplicación, los datos se recuperan del </w:t>
+      </w:r>
+      <w:proofErr w:type="spellStart"/>
+      <w:r>
+        <w:t>localStorage</w:t>
+      </w:r>
+      <w:proofErr w:type="spellEnd"/>
+      <w:r>
+        <w:t>.</w:t>
+      </w:r>
+    </w:p>
+    <w:p>
+      <w:r>
+        <w:t xml:space="preserve">Un hallazgo importante del análisis es que, aunque la aplicación tiene seis responsabilidades distintas, </w:t>
+      </w:r>
+      <w:r>
+        <w:rPr>
+          <w:b/>
+          <w:bCs/>
+        </w:rPr>
+        <w:t xml:space="preserve">todas están implementadas en un único componente, </w:t>
+      </w:r>
+      <w:proofErr w:type="spellStart"/>
+      <w:r>
+        <w:rPr>
+          <w:b/>
+          <w:bCs/>
+        </w:rPr>
+        <w:t>App.jsx</w:t>
+      </w:r>
+      <w:proofErr w:type="spellEnd"/>
+      <w:r>
+        <w:t>, como se observa en la Figura 1. Este punto es la base del diagnóstico de la siguiente sección.</w:t>
+      </w:r>
+    </w:p>
+    <w:p/>
+    <w:p>
+      <w:r>
+        <w:lastRenderedPageBreak/>
+        <w:tab/>
+      </w:r>
+      <w:r>
+        <w:t>Figura 1. Diagrama de funcionamiento (v1.0)</w:t>
+      </w:r>
+    </w:p>
+    <w:p>
+      <w:pPr>
+        <w:jc w:val="center"/>
+      </w:pPr>
+      <w:r>
+        <w:rPr>
+          <w:noProof/>
+        </w:rPr>
+        <w:drawing>
+          <wp:inline distT="0" distB="0" distL="0" distR="0" wp14:anchorId="59CE0DC8" wp14:editId="18D9CD57">
+            <wp:extent cx="3994546" cy="2796363"/>
+            <wp:effectExtent l="19050" t="19050" r="25400" b="23495"/>
+            <wp:docPr id="730329534" name="Imagen 1"/>
+            <wp:cNvGraphicFramePr>
+              <a:graphicFrameLocks xmlns:a="http://schemas.openxmlformats.org/drawingml/2006/main" noChangeAspect="1"/>
+            </wp:cNvGraphicFramePr>
+            <a:graphic xmlns:a="http://schemas.openxmlformats.org/drawingml/2006/main">
+              <a:graphicData uri="http://schemas.openxmlformats.org/drawingml/2006/picture">
+                <pic:pic xmlns:pic="http://schemas.openxmlformats.org/drawingml/2006/picture">
+                  <pic:nvPicPr>
+                    <pic:cNvPr id="730329534" name="Imagen 730329534"/>
+                    <pic:cNvPicPr/>
+                  </pic:nvPicPr>
+                  <pic:blipFill>
+                    <a:blip r:embed="rId22" cstate="print">
+                      <a:extLst>
+                        <a:ext uri="{28A0092B-C50C-407E-A947-70E740481C1C}">
+                          <a14:useLocalDpi xmlns:a14="http://schemas.microsoft.com/office/drawing/2010/main" val="0"/>
+                        </a:ext>
+                      </a:extLst>
+                    </a:blip>
+                    <a:stretch>
+                      <a:fillRect/>
+                    </a:stretch>
+                  </pic:blipFill>
+                  <pic:spPr>
+                    <a:xfrm>
+                      <a:off x="0" y="0"/>
+                      <a:ext cx="4006401" cy="2804662"/>
+                    </a:xfrm>
+                    <a:prstGeom prst="rect">
+                      <a:avLst/>
+                    </a:prstGeom>
+                    <a:ln w="12700">
+                      <a:solidFill>
+                        <a:schemeClr val="tx1"/>
+                      </a:solidFill>
+                    </a:ln>
+                  </pic:spPr>
+                </pic:pic>
+              </a:graphicData>
+            </a:graphic>
+          </wp:inline>
+        </w:drawing>
+      </w:r>
+    </w:p>
+    <w:p>
+      <w:pPr>
+        <w:ind w:left="708"/>
+      </w:pPr>
+      <w:r>
+        <w:t xml:space="preserve">El diagrama muestra el flujo: el docente registra datos en el formulario, estos pasan por validación, luego se calculan el promedio y el estado, y el resultado alimenta la tabla y el resumen. Todo ocurre </w:t>
+      </w:r>
+      <w:r>
+        <w:rPr>
+          <w:b/>
+          <w:bCs/>
+        </w:rPr>
+        <w:t>dentro de la misma caja morada</w:t>
+      </w:r>
+      <w:r>
+        <w:t xml:space="preserve">, y la comunicación con </w:t>
+      </w:r>
+      <w:proofErr w:type="spellStart"/>
+      <w:r>
+        <w:t>localStorage</w:t>
+      </w:r>
+      <w:proofErr w:type="spellEnd"/>
+      <w:r>
+        <w:t xml:space="preserve"> sale directamente de ese componente. Visualmente ya se anticipa el problema principal (el componente que hace de todo), así que el diagrama sirve tanto para la descripción como para el diagnóstico.</w:t>
       </w:r>
     </w:p>
     <w:sectPr>
@@ -2457,6 +3623,69 @@
       <w:spacing w:val="5"/>
     </w:rPr>
   </w:style>
+  <w:style w:type="table" w:styleId="Tablanormal1">
+    <w:name w:val="Plain Table 1"/>
+    <w:basedOn w:val="Tablanormal"/>
+    <w:uiPriority w:val="41"/>
+    <w:rsid w:val="00541A65"/>
+    <w:pPr>
+      <w:spacing w:after="0" w:line="240" w:lineRule="auto"/>
+    </w:pPr>
+    <w:tblPr>
+      <w:tblStyleRowBandSize w:val="1"/>
+      <w:tblStyleColBandSize w:val="1"/>
+      <w:tblBorders>
+        <w:top w:val="single" w:sz="4" w:space="0" w:color="BFBFBF" w:themeColor="background1" w:themeShade="BF"/>
+        <w:left w:val="single" w:sz="4" w:space="0" w:color="BFBFBF" w:themeColor="background1" w:themeShade="BF"/>
+        <w:bottom w:val="single" w:sz="4" w:space="0" w:color="BFBFBF" w:themeColor="background1" w:themeShade="BF"/>
+        <w:right w:val="single" w:sz="4" w:space="0" w:color="BFBFBF" w:themeColor="background1" w:themeShade="BF"/>
+        <w:insideH w:val="single" w:sz="4" w:space="0" w:color="BFBFBF" w:themeColor="background1" w:themeShade="BF"/>
+        <w:insideV w:val="single" w:sz="4" w:space="0" w:color="BFBFBF" w:themeColor="background1" w:themeShade="BF"/>
+      </w:tblBorders>
+    </w:tblPr>
+    <w:tblStylePr w:type="firstRow">
+      <w:rPr>
+        <w:b/>
+        <w:bCs/>
+      </w:rPr>
+    </w:tblStylePr>
+    <w:tblStylePr w:type="lastRow">
+      <w:rPr>
+        <w:b/>
+        <w:bCs/>
+      </w:rPr>
+      <w:tblPr/>
+      <w:tcPr>
+        <w:tcBorders>
+          <w:top w:val="double" w:sz="4" w:space="0" w:color="BFBFBF" w:themeColor="background1" w:themeShade="BF"/>
+        </w:tcBorders>
+      </w:tcPr>
+    </w:tblStylePr>
+    <w:tblStylePr w:type="firstCol">
+      <w:rPr>
+        <w:b/>
+        <w:bCs/>
+      </w:rPr>
+    </w:tblStylePr>
+    <w:tblStylePr w:type="lastCol">
+      <w:rPr>
+        <w:b/>
+        <w:bCs/>
+      </w:rPr>
+    </w:tblStylePr>
+    <w:tblStylePr w:type="band1Vert">
+      <w:tblPr/>
+      <w:tcPr>
+        <w:shd w:val="clear" w:color="auto" w:fill="F2F2F2" w:themeFill="background1" w:themeFillShade="F2"/>
+      </w:tcPr>
+    </w:tblStylePr>
+    <w:tblStylePr w:type="band1Horz">
+      <w:tblPr/>
+      <w:tcPr>
+        <w:shd w:val="clear" w:color="auto" w:fill="F2F2F2" w:themeFill="background1" w:themeFillShade="F2"/>
+      </w:tcPr>
+    </w:tblStylePr>
+  </w:style>
 </w:styles>
 </file>
 

</xml_diff>

<commit_message>
docs: agregar descripción y diagrama de funcionamiento v1
</commit_message>
<xml_diff>
--- a/docs/evidencias/antes/NotaFácil – Sistema de gestión de notas académicas.docx
+++ b/docs/evidencias/antes/NotaFácil – Sistema de gestión de notas académicas.docx
@@ -2551,9 +2551,6 @@
       </w:r>
     </w:p>
     <w:p>
-      <w:pPr>
-        <w:ind w:left="708"/>
-      </w:pPr>
       <w:r>
         <w:t xml:space="preserve">El diagrama muestra el flujo: el docente registra datos en el formulario, estos pasan por validación, luego se calculan el promedio y el estado, y el resultado alimenta la tabla y el resumen. Todo ocurre </w:t>
       </w:r>
@@ -2569,6 +2566,10 @@
       </w:r>
       <w:proofErr w:type="spellStart"/>
       <w:r>
+        <w:rPr>
+          <w:b/>
+          <w:bCs/>
+        </w:rPr>
         <w:t>localStorage</w:t>
       </w:r>
       <w:proofErr w:type="spellEnd"/>

</xml_diff>

<commit_message>
docs: agregar diagnostico inicial, plan de mantenimiento y casos de prueba
</commit_message>
<xml_diff>
--- a/docs/evidencias/antes/NotaFácil – Sistema de gestión de notas académicas.docx
+++ b/docs/evidencias/antes/NotaFácil – Sistema de gestión de notas académicas.docx
@@ -462,9 +462,9 @@
           <w:noProof/>
         </w:rPr>
         <w:drawing>
-          <wp:inline distT="0" distB="0" distL="0" distR="0" wp14:anchorId="6329DA67" wp14:editId="40DB2783">
-            <wp:extent cx="4057650" cy="2464594"/>
-            <wp:effectExtent l="0" t="0" r="0" b="0"/>
+          <wp:inline distT="0" distB="0" distL="0" distR="0" wp14:anchorId="6329DA67" wp14:editId="1DC386B7">
+            <wp:extent cx="4150433" cy="2520950"/>
+            <wp:effectExtent l="0" t="0" r="2540" b="0"/>
             <wp:docPr id="131412336" name="Imagen 1"/>
             <wp:cNvGraphicFramePr>
               <a:graphicFrameLocks xmlns:a="http://schemas.openxmlformats.org/drawingml/2006/main" noChangeAspect="1"/>
@@ -485,7 +485,7 @@
                   <pic:spPr>
                     <a:xfrm>
                       <a:off x="0" y="0"/>
-                      <a:ext cx="4061575" cy="2466978"/>
+                      <a:ext cx="4155251" cy="2523876"/>
                     </a:xfrm>
                     <a:prstGeom prst="rect">
                       <a:avLst/>
@@ -2115,12 +2115,42 @@
           <w:bCs/>
         </w:rPr>
       </w:pPr>
+      <w:proofErr w:type="spellStart"/>
       <w:r>
         <w:rPr>
           <w:b/>
           <w:bCs/>
         </w:rPr>
         <w:lastRenderedPageBreak/>
+        <w:t>NotaFácil</w:t>
+      </w:r>
+      <w:proofErr w:type="spellEnd"/>
+      <w:r>
+        <w:rPr>
+          <w:b/>
+          <w:bCs/>
+        </w:rPr>
+        <w:t xml:space="preserve"> – Sistema de gestión de notas académicas. Registra estudiantes y sus notas, calcula promedios y muestra si aprobó o desaprobó.</w:t>
+      </w:r>
+      <w:r>
+        <w:rPr>
+          <w:b/>
+          <w:bCs/>
+        </w:rPr>
+        <w:br/>
+      </w:r>
+      <w:r>
+        <w:rPr>
+          <w:b/>
+          <w:bCs/>
+        </w:rPr>
+        <w:br/>
+      </w:r>
+      <w:r>
+        <w:rPr>
+          <w:b/>
+          <w:bCs/>
+        </w:rPr>
         <w:t>1. Descripción de la aplicación</w:t>
       </w:r>
     </w:p>
@@ -2477,6 +2507,7 @@
           <w:b/>
           <w:bCs/>
         </w:rPr>
+        <w:lastRenderedPageBreak/>
         <w:t>App.jsx</w:t>
       </w:r>
       <w:proofErr w:type="spellEnd"/>
@@ -2487,7 +2518,6 @@
     <w:p/>
     <w:p>
       <w:r>
-        <w:lastRenderedPageBreak/>
         <w:tab/>
       </w:r>
       <w:r>
@@ -2576,6 +2606,1874 @@
       <w:r>
         <w:t xml:space="preserve"> sale directamente de ese componente. Visualmente ya se anticipa el problema principal (el componente que hace de todo), así que el diagrama sirve tanto para la descripción como para el diagnóstico.</w:t>
       </w:r>
+    </w:p>
+    <w:p>
+      <w:pPr>
+        <w:rPr>
+          <w:b/>
+          <w:bCs/>
+        </w:rPr>
+      </w:pPr>
+      <w:r>
+        <w:rPr>
+          <w:b/>
+          <w:bCs/>
+        </w:rPr>
+        <w:t>2. Diagnóstico inicial</w:t>
+      </w:r>
+    </w:p>
+    <w:p>
+      <w:r>
+        <w:t xml:space="preserve">Se analizó el código fuente de la versión 1.0 (tag v1.0-baseline-inicial), centrado en el archivo </w:t>
+      </w:r>
+      <w:proofErr w:type="spellStart"/>
+      <w:r>
+        <w:rPr>
+          <w:b/>
+          <w:bCs/>
+        </w:rPr>
+        <w:t>src</w:t>
+      </w:r>
+      <w:proofErr w:type="spellEnd"/>
+      <w:r>
+        <w:rPr>
+          <w:b/>
+          <w:bCs/>
+        </w:rPr>
+        <w:t>/</w:t>
+      </w:r>
+      <w:proofErr w:type="spellStart"/>
+      <w:r>
+        <w:rPr>
+          <w:b/>
+          <w:bCs/>
+        </w:rPr>
+        <w:t>App.jsx</w:t>
+      </w:r>
+      <w:proofErr w:type="spellEnd"/>
+      <w:r>
+        <w:t>, que concentra toda la lógica de la aplicación. Se identificaron cinco problemas de mantenibilidad:</w:t>
+      </w:r>
+    </w:p>
+    <w:tbl>
+      <w:tblPr>
+        <w:tblStyle w:val="Tablanormal1"/>
+        <w:tblW w:w="0" w:type="auto"/>
+        <w:tblLook w:val="04A0" w:firstRow="1" w:lastRow="0" w:firstColumn="1" w:lastColumn="0" w:noHBand="0" w:noVBand="1"/>
+      </w:tblPr>
+      <w:tblGrid>
+        <w:gridCol w:w="467"/>
+        <w:gridCol w:w="3120"/>
+        <w:gridCol w:w="1543"/>
+        <w:gridCol w:w="1303"/>
+        <w:gridCol w:w="2395"/>
+      </w:tblGrid>
+      <w:tr>
+        <w:trPr>
+          <w:cnfStyle w:val="100000000000" w:firstRow="1" w:lastRow="0" w:firstColumn="0" w:lastColumn="0" w:oddVBand="0" w:evenVBand="0" w:oddHBand="0" w:evenHBand="0" w:firstRowFirstColumn="0" w:firstRowLastColumn="0" w:lastRowFirstColumn="0" w:lastRowLastColumn="0"/>
+        </w:trPr>
+        <w:tc>
+          <w:tcPr>
+            <w:cnfStyle w:val="001000000000" w:firstRow="0" w:lastRow="0" w:firstColumn="1" w:lastColumn="0" w:oddVBand="0" w:evenVBand="0" w:oddHBand="0" w:evenHBand="0" w:firstRowFirstColumn="0" w:firstRowLastColumn="0" w:lastRowFirstColumn="0" w:lastRowLastColumn="0"/>
+            <w:tcW w:w="0" w:type="auto"/>
+            <w:hideMark/>
+          </w:tcPr>
+          <w:p>
+            <w:pPr>
+              <w:spacing w:after="160" w:line="278" w:lineRule="auto"/>
+            </w:pPr>
+            <w:proofErr w:type="spellStart"/>
+            <w:r>
+              <w:t>N°</w:t>
+            </w:r>
+            <w:proofErr w:type="spellEnd"/>
+          </w:p>
+        </w:tc>
+        <w:tc>
+          <w:tcPr>
+            <w:tcW w:w="0" w:type="auto"/>
+            <w:hideMark/>
+          </w:tcPr>
+          <w:p>
+            <w:pPr>
+              <w:spacing w:after="160" w:line="278" w:lineRule="auto"/>
+              <w:cnfStyle w:val="100000000000" w:firstRow="1" w:lastRow="0" w:firstColumn="0" w:lastColumn="0" w:oddVBand="0" w:evenVBand="0" w:oddHBand="0" w:evenHBand="0" w:firstRowFirstColumn="0" w:firstRowLastColumn="0" w:lastRowFirstColumn="0" w:lastRowLastColumn="0"/>
+            </w:pPr>
+            <w:r>
+              <w:t>Problema (</w:t>
+            </w:r>
+            <w:proofErr w:type="spellStart"/>
+            <w:r>
+              <w:t>code</w:t>
+            </w:r>
+            <w:proofErr w:type="spellEnd"/>
+            <w:r>
+              <w:t xml:space="preserve"> </w:t>
+            </w:r>
+            <w:proofErr w:type="spellStart"/>
+            <w:r>
+              <w:t>smell</w:t>
+            </w:r>
+            <w:proofErr w:type="spellEnd"/>
+            <w:r>
+              <w:t>)</w:t>
+            </w:r>
+          </w:p>
+        </w:tc>
+        <w:tc>
+          <w:tcPr>
+            <w:tcW w:w="0" w:type="auto"/>
+            <w:hideMark/>
+          </w:tcPr>
+          <w:p>
+            <w:pPr>
+              <w:spacing w:after="160" w:line="278" w:lineRule="auto"/>
+              <w:cnfStyle w:val="100000000000" w:firstRow="1" w:lastRow="0" w:firstColumn="0" w:lastColumn="0" w:oddVBand="0" w:evenVBand="0" w:oddHBand="0" w:evenHBand="0" w:firstRowFirstColumn="0" w:firstRowLastColumn="0" w:lastRowFirstColumn="0" w:lastRowLastColumn="0"/>
+            </w:pPr>
+            <w:r>
+              <w:t xml:space="preserve">Ubicación en </w:t>
+            </w:r>
+            <w:proofErr w:type="spellStart"/>
+            <w:r>
+              <w:t>App.jsx</w:t>
+            </w:r>
+            <w:proofErr w:type="spellEnd"/>
+          </w:p>
+        </w:tc>
+        <w:tc>
+          <w:tcPr>
+            <w:tcW w:w="0" w:type="auto"/>
+            <w:hideMark/>
+          </w:tcPr>
+          <w:p>
+            <w:pPr>
+              <w:spacing w:after="160" w:line="278" w:lineRule="auto"/>
+              <w:cnfStyle w:val="100000000000" w:firstRow="1" w:lastRow="0" w:firstColumn="0" w:lastColumn="0" w:oddVBand="0" w:evenVBand="0" w:oddHBand="0" w:evenHBand="0" w:firstRowFirstColumn="0" w:firstRowLastColumn="0" w:lastRowFirstColumn="0" w:lastRowLastColumn="0"/>
+            </w:pPr>
+            <w:r>
+              <w:t>Principio afectado</w:t>
+            </w:r>
+          </w:p>
+        </w:tc>
+        <w:tc>
+          <w:tcPr>
+            <w:tcW w:w="0" w:type="auto"/>
+            <w:hideMark/>
+          </w:tcPr>
+          <w:p>
+            <w:pPr>
+              <w:spacing w:after="160" w:line="278" w:lineRule="auto"/>
+              <w:cnfStyle w:val="100000000000" w:firstRow="1" w:lastRow="0" w:firstColumn="0" w:lastColumn="0" w:oddVBand="0" w:evenVBand="0" w:oddHBand="0" w:evenHBand="0" w:firstRowFirstColumn="0" w:firstRowLastColumn="0" w:lastRowFirstColumn="0" w:lastRowLastColumn="0"/>
+            </w:pPr>
+            <w:r>
+              <w:t>Consecuencia</w:t>
+            </w:r>
+          </w:p>
+        </w:tc>
+      </w:tr>
+      <w:tr>
+        <w:trPr>
+          <w:cnfStyle w:val="000000100000" w:firstRow="0" w:lastRow="0" w:firstColumn="0" w:lastColumn="0" w:oddVBand="0" w:evenVBand="0" w:oddHBand="1" w:evenHBand="0" w:firstRowFirstColumn="0" w:firstRowLastColumn="0" w:lastRowFirstColumn="0" w:lastRowLastColumn="0"/>
+        </w:trPr>
+        <w:tc>
+          <w:tcPr>
+            <w:cnfStyle w:val="001000000000" w:firstRow="0" w:lastRow="0" w:firstColumn="1" w:lastColumn="0" w:oddVBand="0" w:evenVBand="0" w:oddHBand="0" w:evenHBand="0" w:firstRowFirstColumn="0" w:firstRowLastColumn="0" w:lastRowFirstColumn="0" w:lastRowLastColumn="0"/>
+            <w:tcW w:w="0" w:type="auto"/>
+            <w:hideMark/>
+          </w:tcPr>
+          <w:p>
+            <w:pPr>
+              <w:spacing w:after="160" w:line="278" w:lineRule="auto"/>
+            </w:pPr>
+            <w:r>
+              <w:t>P1</w:t>
+            </w:r>
+          </w:p>
+        </w:tc>
+        <w:tc>
+          <w:tcPr>
+            <w:tcW w:w="0" w:type="auto"/>
+            <w:hideMark/>
+          </w:tcPr>
+          <w:p>
+            <w:pPr>
+              <w:spacing w:after="160" w:line="278" w:lineRule="auto"/>
+              <w:cnfStyle w:val="000000100000" w:firstRow="0" w:lastRow="0" w:firstColumn="0" w:lastColumn="0" w:oddVBand="0" w:evenVBand="0" w:oddHBand="1" w:evenHBand="0" w:firstRowFirstColumn="0" w:firstRowLastColumn="0" w:lastRowFirstColumn="0" w:lastRowLastColumn="0"/>
+            </w:pPr>
+            <w:r>
+              <w:rPr>
+                <w:b/>
+                <w:bCs/>
+              </w:rPr>
+              <w:t>Componente "Dios"</w:t>
+            </w:r>
+            <w:r>
+              <w:t xml:space="preserve"> (</w:t>
+            </w:r>
+            <w:r>
+              <w:rPr>
+                <w:i/>
+                <w:iCs/>
+              </w:rPr>
+              <w:t xml:space="preserve">God </w:t>
+            </w:r>
+            <w:proofErr w:type="spellStart"/>
+            <w:r>
+              <w:rPr>
+                <w:i/>
+                <w:iCs/>
+              </w:rPr>
+              <w:t>Component</w:t>
+            </w:r>
+            <w:proofErr w:type="spellEnd"/>
+            <w:r>
+              <w:t>): un solo componente de 261 líneas maneja formulario, validación, cálculos, persistencia, tabla y estadísticas.</w:t>
+            </w:r>
+          </w:p>
+        </w:tc>
+        <w:tc>
+          <w:tcPr>
+            <w:tcW w:w="0" w:type="auto"/>
+            <w:hideMark/>
+          </w:tcPr>
+          <w:p>
+            <w:pPr>
+              <w:spacing w:after="160" w:line="278" w:lineRule="auto"/>
+              <w:cnfStyle w:val="000000100000" w:firstRow="0" w:lastRow="0" w:firstColumn="0" w:lastColumn="0" w:oddVBand="0" w:evenVBand="0" w:oddHBand="1" w:evenHBand="0" w:firstRowFirstColumn="0" w:firstRowLastColumn="0" w:lastRowFirstColumn="0" w:lastRowLastColumn="0"/>
+            </w:pPr>
+            <w:r>
+              <w:t>Todo el archivo</w:t>
+            </w:r>
+          </w:p>
+        </w:tc>
+        <w:tc>
+          <w:tcPr>
+            <w:tcW w:w="0" w:type="auto"/>
+            <w:hideMark/>
+          </w:tcPr>
+          <w:p>
+            <w:pPr>
+              <w:spacing w:after="160" w:line="278" w:lineRule="auto"/>
+              <w:cnfStyle w:val="000000100000" w:firstRow="0" w:lastRow="0" w:firstColumn="0" w:lastColumn="0" w:oddVBand="0" w:evenVBand="0" w:oddHBand="1" w:evenHBand="0" w:firstRowFirstColumn="0" w:firstRowLastColumn="0" w:lastRowFirstColumn="0" w:lastRowLastColumn="0"/>
+            </w:pPr>
+            <w:r>
+              <w:t>SRP</w:t>
+            </w:r>
+          </w:p>
+        </w:tc>
+        <w:tc>
+          <w:tcPr>
+            <w:tcW w:w="0" w:type="auto"/>
+            <w:hideMark/>
+          </w:tcPr>
+          <w:p>
+            <w:pPr>
+              <w:spacing w:after="160" w:line="278" w:lineRule="auto"/>
+              <w:cnfStyle w:val="000000100000" w:firstRow="0" w:lastRow="0" w:firstColumn="0" w:lastColumn="0" w:oddVBand="0" w:evenVBand="0" w:oddHBand="1" w:evenHBand="0" w:firstRowFirstColumn="0" w:firstRowLastColumn="0" w:lastRowFirstColumn="0" w:lastRowLastColumn="0"/>
+            </w:pPr>
+            <w:r>
+              <w:t>Cualquier cambio obliga a modificar el mismo archivo, lo que aumenta el riesgo de romper otras funciones.</w:t>
+            </w:r>
+          </w:p>
+        </w:tc>
+      </w:tr>
+      <w:tr>
+        <w:tc>
+          <w:tcPr>
+            <w:cnfStyle w:val="001000000000" w:firstRow="0" w:lastRow="0" w:firstColumn="1" w:lastColumn="0" w:oddVBand="0" w:evenVBand="0" w:oddHBand="0" w:evenHBand="0" w:firstRowFirstColumn="0" w:firstRowLastColumn="0" w:lastRowFirstColumn="0" w:lastRowLastColumn="0"/>
+            <w:tcW w:w="0" w:type="auto"/>
+            <w:hideMark/>
+          </w:tcPr>
+          <w:p>
+            <w:pPr>
+              <w:spacing w:after="160" w:line="278" w:lineRule="auto"/>
+            </w:pPr>
+            <w:r>
+              <w:t>P2</w:t>
+            </w:r>
+          </w:p>
+        </w:tc>
+        <w:tc>
+          <w:tcPr>
+            <w:tcW w:w="0" w:type="auto"/>
+            <w:hideMark/>
+          </w:tcPr>
+          <w:p>
+            <w:pPr>
+              <w:spacing w:after="160" w:line="278" w:lineRule="auto"/>
+              <w:cnfStyle w:val="000000000000" w:firstRow="0" w:lastRow="0" w:firstColumn="0" w:lastColumn="0" w:oddVBand="0" w:evenVBand="0" w:oddHBand="0" w:evenHBand="0" w:firstRowFirstColumn="0" w:firstRowLastColumn="0" w:lastRowFirstColumn="0" w:lastRowLastColumn="0"/>
+            </w:pPr>
+            <w:r>
+              <w:rPr>
+                <w:b/>
+                <w:bCs/>
+              </w:rPr>
+              <w:t>Código duplicado</w:t>
+            </w:r>
+            <w:r>
+              <w:t xml:space="preserve">: las validaciones están copiadas en dos funciones y la fórmula </w:t>
+            </w:r>
+            <w:r>
+              <w:lastRenderedPageBreak/>
+              <w:t>del promedio aparece dos veces.</w:t>
+            </w:r>
+          </w:p>
+        </w:tc>
+        <w:tc>
+          <w:tcPr>
+            <w:tcW w:w="0" w:type="auto"/>
+            <w:hideMark/>
+          </w:tcPr>
+          <w:p>
+            <w:pPr>
+              <w:spacing w:after="160" w:line="278" w:lineRule="auto"/>
+              <w:cnfStyle w:val="000000000000" w:firstRow="0" w:lastRow="0" w:firstColumn="0" w:lastColumn="0" w:oddVBand="0" w:evenVBand="0" w:oddHBand="0" w:evenHBand="0" w:firstRowFirstColumn="0" w:firstRowLastColumn="0" w:lastRowFirstColumn="0" w:lastRowLastColumn="0"/>
+            </w:pPr>
+            <w:r>
+              <w:lastRenderedPageBreak/>
+              <w:t xml:space="preserve">Validación: líneas 31–46 y 62–77. Promedio: </w:t>
+            </w:r>
+            <w:r>
+              <w:lastRenderedPageBreak/>
+              <w:t>líneas 117 y 222.</w:t>
+            </w:r>
+          </w:p>
+        </w:tc>
+        <w:tc>
+          <w:tcPr>
+            <w:tcW w:w="0" w:type="auto"/>
+            <w:hideMark/>
+          </w:tcPr>
+          <w:p>
+            <w:pPr>
+              <w:spacing w:after="160" w:line="278" w:lineRule="auto"/>
+              <w:cnfStyle w:val="000000000000" w:firstRow="0" w:lastRow="0" w:firstColumn="0" w:lastColumn="0" w:oddVBand="0" w:evenVBand="0" w:oddHBand="0" w:evenHBand="0" w:firstRowFirstColumn="0" w:firstRowLastColumn="0" w:lastRowFirstColumn="0" w:lastRowLastColumn="0"/>
+            </w:pPr>
+            <w:r>
+              <w:lastRenderedPageBreak/>
+              <w:t>DRY</w:t>
+            </w:r>
+          </w:p>
+        </w:tc>
+        <w:tc>
+          <w:tcPr>
+            <w:tcW w:w="0" w:type="auto"/>
+            <w:hideMark/>
+          </w:tcPr>
+          <w:p>
+            <w:pPr>
+              <w:spacing w:after="160" w:line="278" w:lineRule="auto"/>
+              <w:cnfStyle w:val="000000000000" w:firstRow="0" w:lastRow="0" w:firstColumn="0" w:lastColumn="0" w:oddVBand="0" w:evenVBand="0" w:oddHBand="0" w:evenHBand="0" w:firstRowFirstColumn="0" w:firstRowLastColumn="0" w:lastRowFirstColumn="0" w:lastRowLastColumn="0"/>
+            </w:pPr>
+            <w:r>
+              <w:t xml:space="preserve">Si cambia una regla, hay que corregirla en varios lugares; si se </w:t>
+            </w:r>
+            <w:r>
+              <w:lastRenderedPageBreak/>
+              <w:t xml:space="preserve">olvida uno, la </w:t>
+            </w:r>
+            <w:proofErr w:type="gramStart"/>
+            <w:r>
+              <w:t>app</w:t>
+            </w:r>
+            <w:proofErr w:type="gramEnd"/>
+            <w:r>
+              <w:t xml:space="preserve"> queda inconsistente.</w:t>
+            </w:r>
+          </w:p>
+        </w:tc>
+      </w:tr>
+      <w:tr>
+        <w:trPr>
+          <w:cnfStyle w:val="000000100000" w:firstRow="0" w:lastRow="0" w:firstColumn="0" w:lastColumn="0" w:oddVBand="0" w:evenVBand="0" w:oddHBand="1" w:evenHBand="0" w:firstRowFirstColumn="0" w:firstRowLastColumn="0" w:lastRowFirstColumn="0" w:lastRowLastColumn="0"/>
+        </w:trPr>
+        <w:tc>
+          <w:tcPr>
+            <w:cnfStyle w:val="001000000000" w:firstRow="0" w:lastRow="0" w:firstColumn="1" w:lastColumn="0" w:oddVBand="0" w:evenVBand="0" w:oddHBand="0" w:evenHBand="0" w:firstRowFirstColumn="0" w:firstRowLastColumn="0" w:lastRowFirstColumn="0" w:lastRowLastColumn="0"/>
+            <w:tcW w:w="0" w:type="auto"/>
+            <w:hideMark/>
+          </w:tcPr>
+          <w:p>
+            <w:pPr>
+              <w:spacing w:after="160" w:line="278" w:lineRule="auto"/>
+            </w:pPr>
+            <w:r>
+              <w:lastRenderedPageBreak/>
+              <w:t>P3</w:t>
+            </w:r>
+          </w:p>
+        </w:tc>
+        <w:tc>
+          <w:tcPr>
+            <w:tcW w:w="0" w:type="auto"/>
+            <w:hideMark/>
+          </w:tcPr>
+          <w:p>
+            <w:pPr>
+              <w:spacing w:after="160" w:line="278" w:lineRule="auto"/>
+              <w:cnfStyle w:val="000000100000" w:firstRow="0" w:lastRow="0" w:firstColumn="0" w:lastColumn="0" w:oddVBand="0" w:evenVBand="0" w:oddHBand="1" w:evenHBand="0" w:firstRowFirstColumn="0" w:firstRowLastColumn="0" w:lastRowFirstColumn="0" w:lastRowLastColumn="0"/>
+            </w:pPr>
+            <w:r>
+              <w:rPr>
+                <w:b/>
+                <w:bCs/>
+              </w:rPr>
+              <w:t>Números mágicos</w:t>
+            </w:r>
+            <w:r>
+              <w:t>: 0.3, 0.4, 10.5, 17 y 20 escritos directamente, sin nombre.</w:t>
+            </w:r>
+          </w:p>
+        </w:tc>
+        <w:tc>
+          <w:tcPr>
+            <w:tcW w:w="0" w:type="auto"/>
+            <w:hideMark/>
+          </w:tcPr>
+          <w:p>
+            <w:pPr>
+              <w:spacing w:after="160" w:line="278" w:lineRule="auto"/>
+              <w:cnfStyle w:val="000000100000" w:firstRow="0" w:lastRow="0" w:firstColumn="0" w:lastColumn="0" w:oddVBand="0" w:evenVBand="0" w:oddHBand="1" w:evenHBand="0" w:firstRowFirstColumn="0" w:firstRowLastColumn="0" w:lastRowFirstColumn="0" w:lastRowLastColumn="0"/>
+            </w:pPr>
+            <w:r>
+              <w:t>Líneas 40, 71, 117, 119, 222, 225, 228</w:t>
+            </w:r>
+          </w:p>
+        </w:tc>
+        <w:tc>
+          <w:tcPr>
+            <w:tcW w:w="0" w:type="auto"/>
+            <w:hideMark/>
+          </w:tcPr>
+          <w:p>
+            <w:pPr>
+              <w:spacing w:after="160" w:line="278" w:lineRule="auto"/>
+              <w:cnfStyle w:val="000000100000" w:firstRow="0" w:lastRow="0" w:firstColumn="0" w:lastColumn="0" w:oddVBand="0" w:evenVBand="0" w:oddHBand="1" w:evenHBand="0" w:firstRowFirstColumn="0" w:firstRowLastColumn="0" w:lastRowFirstColumn="0" w:lastRowLastColumn="0"/>
+            </w:pPr>
+            <w:r>
+              <w:t>Legibilidad / DRY</w:t>
+            </w:r>
+          </w:p>
+        </w:tc>
+        <w:tc>
+          <w:tcPr>
+            <w:tcW w:w="0" w:type="auto"/>
+            <w:hideMark/>
+          </w:tcPr>
+          <w:p>
+            <w:pPr>
+              <w:spacing w:after="160" w:line="278" w:lineRule="auto"/>
+              <w:cnfStyle w:val="000000100000" w:firstRow="0" w:lastRow="0" w:firstColumn="0" w:lastColumn="0" w:oddVBand="0" w:evenVBand="0" w:oddHBand="1" w:evenHBand="0" w:firstRowFirstColumn="0" w:firstRowLastColumn="0" w:lastRowFirstColumn="0" w:lastRowLastColumn="0"/>
+            </w:pPr>
+            <w:r>
+              <w:t>No se entiende qué representa cada valor y cambiarlos implica buscarlos a mano.</w:t>
+            </w:r>
+          </w:p>
+        </w:tc>
+      </w:tr>
+      <w:tr>
+        <w:tc>
+          <w:tcPr>
+            <w:cnfStyle w:val="001000000000" w:firstRow="0" w:lastRow="0" w:firstColumn="1" w:lastColumn="0" w:oddVBand="0" w:evenVBand="0" w:oddHBand="0" w:evenHBand="0" w:firstRowFirstColumn="0" w:firstRowLastColumn="0" w:lastRowFirstColumn="0" w:lastRowLastColumn="0"/>
+            <w:tcW w:w="0" w:type="auto"/>
+            <w:hideMark/>
+          </w:tcPr>
+          <w:p>
+            <w:pPr>
+              <w:spacing w:after="160" w:line="278" w:lineRule="auto"/>
+            </w:pPr>
+            <w:r>
+              <w:t>P4</w:t>
+            </w:r>
+          </w:p>
+        </w:tc>
+        <w:tc>
+          <w:tcPr>
+            <w:tcW w:w="0" w:type="auto"/>
+            <w:hideMark/>
+          </w:tcPr>
+          <w:p>
+            <w:pPr>
+              <w:spacing w:after="160" w:line="278" w:lineRule="auto"/>
+              <w:cnfStyle w:val="000000000000" w:firstRow="0" w:lastRow="0" w:firstColumn="0" w:lastColumn="0" w:oddVBand="0" w:evenVBand="0" w:oddHBand="0" w:evenHBand="0" w:firstRowFirstColumn="0" w:firstRowLastColumn="0" w:lastRowFirstColumn="0" w:lastRowLastColumn="0"/>
+            </w:pPr>
+            <w:r>
+              <w:rPr>
+                <w:b/>
+                <w:bCs/>
+              </w:rPr>
+              <w:t xml:space="preserve">Dependencia directa de </w:t>
+            </w:r>
+            <w:proofErr w:type="spellStart"/>
+            <w:r>
+              <w:rPr>
+                <w:b/>
+                <w:bCs/>
+              </w:rPr>
+              <w:t>localStorage</w:t>
+            </w:r>
+            <w:proofErr w:type="spellEnd"/>
+            <w:r>
+              <w:t>: se accede a él en 4 lugares, repitiendo la clave '</w:t>
+            </w:r>
+            <w:proofErr w:type="spellStart"/>
+            <w:r>
+              <w:t>notafacil_estudiantes</w:t>
+            </w:r>
+            <w:proofErr w:type="spellEnd"/>
+            <w:r>
+              <w:t>'.</w:t>
+            </w:r>
+          </w:p>
+        </w:tc>
+        <w:tc>
+          <w:tcPr>
+            <w:tcW w:w="0" w:type="auto"/>
+            <w:hideMark/>
+          </w:tcPr>
+          <w:p>
+            <w:pPr>
+              <w:spacing w:after="160" w:line="278" w:lineRule="auto"/>
+              <w:cnfStyle w:val="000000000000" w:firstRow="0" w:lastRow="0" w:firstColumn="0" w:lastColumn="0" w:oddVBand="0" w:evenVBand="0" w:oddHBand="0" w:evenHBand="0" w:firstRowFirstColumn="0" w:firstRowLastColumn="0" w:lastRowFirstColumn="0" w:lastRowLastColumn="0"/>
+            </w:pPr>
+            <w:r>
+              <w:t>Líneas 15, 58, 85, 103</w:t>
+            </w:r>
+          </w:p>
+        </w:tc>
+        <w:tc>
+          <w:tcPr>
+            <w:tcW w:w="0" w:type="auto"/>
+            <w:hideMark/>
+          </w:tcPr>
+          <w:p>
+            <w:pPr>
+              <w:spacing w:after="160" w:line="278" w:lineRule="auto"/>
+              <w:cnfStyle w:val="000000000000" w:firstRow="0" w:lastRow="0" w:firstColumn="0" w:lastColumn="0" w:oddVBand="0" w:evenVBand="0" w:oddHBand="0" w:evenHBand="0" w:firstRowFirstColumn="0" w:firstRowLastColumn="0" w:lastRowFirstColumn="0" w:lastRowLastColumn="0"/>
+            </w:pPr>
+            <w:r>
+              <w:t>DIP</w:t>
+            </w:r>
+          </w:p>
+        </w:tc>
+        <w:tc>
+          <w:tcPr>
+            <w:tcW w:w="0" w:type="auto"/>
+            <w:hideMark/>
+          </w:tcPr>
+          <w:p>
+            <w:pPr>
+              <w:spacing w:after="160" w:line="278" w:lineRule="auto"/>
+              <w:cnfStyle w:val="000000000000" w:firstRow="0" w:lastRow="0" w:firstColumn="0" w:lastColumn="0" w:oddVBand="0" w:evenVBand="0" w:oddHBand="0" w:evenHBand="0" w:firstRowFirstColumn="0" w:firstRowLastColumn="0" w:lastRowFirstColumn="0" w:lastRowLastColumn="0"/>
+            </w:pPr>
+            <w:r>
+              <w:t>El componente está atado a un tipo de almacenamiento. Migrar a una API o base de datos exigiría reescribirlo.</w:t>
+            </w:r>
+          </w:p>
+        </w:tc>
+      </w:tr>
+      <w:tr>
+        <w:trPr>
+          <w:cnfStyle w:val="000000100000" w:firstRow="0" w:lastRow="0" w:firstColumn="0" w:lastColumn="0" w:oddVBand="0" w:evenVBand="0" w:oddHBand="1" w:evenHBand="0" w:firstRowFirstColumn="0" w:firstRowLastColumn="0" w:lastRowFirstColumn="0" w:lastRowLastColumn="0"/>
+        </w:trPr>
+        <w:tc>
+          <w:tcPr>
+            <w:cnfStyle w:val="001000000000" w:firstRow="0" w:lastRow="0" w:firstColumn="1" w:lastColumn="0" w:oddVBand="0" w:evenVBand="0" w:oddHBand="0" w:evenHBand="0" w:firstRowFirstColumn="0" w:firstRowLastColumn="0" w:lastRowFirstColumn="0" w:lastRowLastColumn="0"/>
+            <w:tcW w:w="0" w:type="auto"/>
+            <w:hideMark/>
+          </w:tcPr>
+          <w:p>
+            <w:pPr>
+              <w:spacing w:after="160" w:line="278" w:lineRule="auto"/>
+            </w:pPr>
+            <w:r>
+              <w:t>P5</w:t>
+            </w:r>
+          </w:p>
+        </w:tc>
+        <w:tc>
+          <w:tcPr>
+            <w:tcW w:w="0" w:type="auto"/>
+            <w:hideMark/>
+          </w:tcPr>
+          <w:p>
+            <w:pPr>
+              <w:spacing w:after="160" w:line="278" w:lineRule="auto"/>
+              <w:cnfStyle w:val="000000100000" w:firstRow="0" w:lastRow="0" w:firstColumn="0" w:lastColumn="0" w:oddVBand="0" w:evenVBand="0" w:oddHBand="1" w:evenHBand="0" w:firstRowFirstColumn="0" w:firstRowLastColumn="0" w:lastRowFirstColumn="0" w:lastRowLastColumn="0"/>
+            </w:pPr>
+            <w:r>
+              <w:rPr>
+                <w:b/>
+                <w:bCs/>
+              </w:rPr>
+              <w:t xml:space="preserve">Cadena de </w:t>
+            </w:r>
+            <w:proofErr w:type="spellStart"/>
+            <w:r>
+              <w:rPr>
+                <w:b/>
+                <w:bCs/>
+              </w:rPr>
+              <w:t>if</w:t>
+            </w:r>
+            <w:proofErr w:type="spellEnd"/>
+            <w:r>
+              <w:rPr>
+                <w:b/>
+                <w:bCs/>
+              </w:rPr>
+              <w:t>/</w:t>
+            </w:r>
+            <w:proofErr w:type="spellStart"/>
+            <w:r>
+              <w:rPr>
+                <w:b/>
+                <w:bCs/>
+              </w:rPr>
+              <w:t>else</w:t>
+            </w:r>
+            <w:proofErr w:type="spellEnd"/>
+            <w:r>
+              <w:rPr>
+                <w:b/>
+                <w:bCs/>
+              </w:rPr>
+              <w:t xml:space="preserve"> para el estado</w:t>
+            </w:r>
+            <w:r>
+              <w:t>: los rangos de Destacado, Aprobado y Desaprobado están fijos en condicionales.</w:t>
+            </w:r>
+          </w:p>
+        </w:tc>
+        <w:tc>
+          <w:tcPr>
+            <w:tcW w:w="0" w:type="auto"/>
+            <w:hideMark/>
+          </w:tcPr>
+          <w:p>
+            <w:pPr>
+              <w:spacing w:after="160" w:line="278" w:lineRule="auto"/>
+              <w:cnfStyle w:val="000000100000" w:firstRow="0" w:lastRow="0" w:firstColumn="0" w:lastColumn="0" w:oddVBand="0" w:evenVBand="0" w:oddHBand="1" w:evenHBand="0" w:firstRowFirstColumn="0" w:firstRowLastColumn="0" w:lastRowFirstColumn="0" w:lastRowLastColumn="0"/>
+            </w:pPr>
+            <w:r>
+              <w:t>Líneas 225–234</w:t>
+            </w:r>
+          </w:p>
+        </w:tc>
+        <w:tc>
+          <w:tcPr>
+            <w:tcW w:w="0" w:type="auto"/>
+            <w:hideMark/>
+          </w:tcPr>
+          <w:p>
+            <w:pPr>
+              <w:spacing w:after="160" w:line="278" w:lineRule="auto"/>
+              <w:cnfStyle w:val="000000100000" w:firstRow="0" w:lastRow="0" w:firstColumn="0" w:lastColumn="0" w:oddVBand="0" w:evenVBand="0" w:oddHBand="1" w:evenHBand="0" w:firstRowFirstColumn="0" w:firstRowLastColumn="0" w:lastRowFirstColumn="0" w:lastRowLastColumn="0"/>
+            </w:pPr>
+            <w:r>
+              <w:t>OCP</w:t>
+            </w:r>
+          </w:p>
+        </w:tc>
+        <w:tc>
+          <w:tcPr>
+            <w:tcW w:w="0" w:type="auto"/>
+            <w:hideMark/>
+          </w:tcPr>
+          <w:p>
+            <w:pPr>
+              <w:spacing w:after="160" w:line="278" w:lineRule="auto"/>
+              <w:cnfStyle w:val="000000100000" w:firstRow="0" w:lastRow="0" w:firstColumn="0" w:lastColumn="0" w:oddVBand="0" w:evenVBand="0" w:oddHBand="1" w:evenHBand="0" w:firstRowFirstColumn="0" w:firstRowLastColumn="0" w:lastRowFirstColumn="0" w:lastRowLastColumn="0"/>
+            </w:pPr>
+            <w:r>
+              <w:t>Agregar un estado nuevo (por ejemplo, "En riesgo") obliga a modificar código existente.</w:t>
+            </w:r>
+          </w:p>
+        </w:tc>
+      </w:tr>
+    </w:tbl>
+    <w:p/>
+    <w:p>
+      <w:r>
+        <w:rPr>
+          <w:b/>
+          <w:bCs/>
+        </w:rPr>
+        <w:t>Evidencia de deuda técnica.</w:t>
+      </w:r>
+      <w:r>
+        <w:t xml:space="preserve"> La aplicación funciona correctamente, pero su diseño acumula deuda técnica: cada cambio futuro costará más de lo necesario. Un ejemplo concreto: si la universidad cambia la ponderación de las evaluaciones, habría que modificar la fórmula en dos lugares distintos (líneas 117 y 222). Si se corrige solo uno, la tabla y el resumen del aula mostrarían promedios diferentes para el mismo estudiante. A esto se suma que </w:t>
+      </w:r>
+      <w:r>
+        <w:rPr>
+          <w:b/>
+          <w:bCs/>
+        </w:rPr>
+        <w:t>la aplicación no tiene pruebas automatizadas</w:t>
+      </w:r>
+      <w:r>
+        <w:t>, por lo que no existe forma rápida de comprobar que un cambio no rompió nada.</w:t>
+      </w:r>
+    </w:p>
+    <w:p>
+      <w:pPr>
+        <w:rPr>
+          <w:b/>
+          <w:bCs/>
+        </w:rPr>
+      </w:pPr>
+      <w:r>
+        <w:rPr>
+          <w:b/>
+          <w:bCs/>
+        </w:rPr>
+        <w:t>3. Plan de mantenimiento</w:t>
+      </w:r>
+    </w:p>
+    <w:p>
+      <w:pPr>
+        <w:rPr>
+          <w:b/>
+          <w:bCs/>
+        </w:rPr>
+      </w:pPr>
+      <w:r>
+        <w:rPr>
+          <w:b/>
+          <w:bCs/>
+        </w:rPr>
+        <w:t>Acción 1: Centralizar las reglas académicas y la validación</w:t>
+      </w:r>
+    </w:p>
+    <w:tbl>
+      <w:tblPr>
+        <w:tblStyle w:val="Tablanormal1"/>
+        <w:tblW w:w="0" w:type="auto"/>
+        <w:tblLook w:val="04A0" w:firstRow="1" w:lastRow="0" w:firstColumn="1" w:lastColumn="0" w:noHBand="0" w:noVBand="1"/>
+      </w:tblPr>
+      <w:tblGrid>
+        <w:gridCol w:w="1912"/>
+        <w:gridCol w:w="6916"/>
+      </w:tblGrid>
+      <w:tr>
+        <w:trPr>
+          <w:cnfStyle w:val="100000000000" w:firstRow="1" w:lastRow="0" w:firstColumn="0" w:lastColumn="0" w:oddVBand="0" w:evenVBand="0" w:oddHBand="0" w:evenHBand="0" w:firstRowFirstColumn="0" w:firstRowLastColumn="0" w:lastRowFirstColumn="0" w:lastRowLastColumn="0"/>
+        </w:trPr>
+        <w:tc>
+          <w:tcPr>
+            <w:cnfStyle w:val="001000000000" w:firstRow="0" w:lastRow="0" w:firstColumn="1" w:lastColumn="0" w:oddVBand="0" w:evenVBand="0" w:oddHBand="0" w:evenHBand="0" w:firstRowFirstColumn="0" w:firstRowLastColumn="0" w:lastRowFirstColumn="0" w:lastRowLastColumn="0"/>
+            <w:tcW w:w="0" w:type="auto"/>
+            <w:hideMark/>
+          </w:tcPr>
+          <w:p>
+            <w:pPr>
+              <w:spacing w:after="160" w:line="278" w:lineRule="auto"/>
+            </w:pPr>
+            <w:r>
+              <w:t>Campo</w:t>
+            </w:r>
+          </w:p>
+        </w:tc>
+        <w:tc>
+          <w:tcPr>
+            <w:tcW w:w="0" w:type="auto"/>
+            <w:hideMark/>
+          </w:tcPr>
+          <w:p>
+            <w:pPr>
+              <w:spacing w:after="160" w:line="278" w:lineRule="auto"/>
+              <w:cnfStyle w:val="100000000000" w:firstRow="1" w:lastRow="0" w:firstColumn="0" w:lastColumn="0" w:oddVBand="0" w:evenVBand="0" w:oddHBand="0" w:evenHBand="0" w:firstRowFirstColumn="0" w:firstRowLastColumn="0" w:lastRowFirstColumn="0" w:lastRowLastColumn="0"/>
+            </w:pPr>
+            <w:r>
+              <w:t>Descripción</w:t>
+            </w:r>
+          </w:p>
+        </w:tc>
+      </w:tr>
+      <w:tr>
+        <w:trPr>
+          <w:cnfStyle w:val="000000100000" w:firstRow="0" w:lastRow="0" w:firstColumn="0" w:lastColumn="0" w:oddVBand="0" w:evenVBand="0" w:oddHBand="1" w:evenHBand="0" w:firstRowFirstColumn="0" w:firstRowLastColumn="0" w:lastRowFirstColumn="0" w:lastRowLastColumn="0"/>
+        </w:trPr>
+        <w:tc>
+          <w:tcPr>
+            <w:cnfStyle w:val="001000000000" w:firstRow="0" w:lastRow="0" w:firstColumn="1" w:lastColumn="0" w:oddVBand="0" w:evenVBand="0" w:oddHBand="0" w:evenHBand="0" w:firstRowFirstColumn="0" w:firstRowLastColumn="0" w:lastRowFirstColumn="0" w:lastRowLastColumn="0"/>
+            <w:tcW w:w="0" w:type="auto"/>
+            <w:hideMark/>
+          </w:tcPr>
+          <w:p>
+            <w:pPr>
+              <w:spacing w:after="160" w:line="278" w:lineRule="auto"/>
+            </w:pPr>
+            <w:r>
+              <w:t>Problema identificado</w:t>
+            </w:r>
+          </w:p>
+        </w:tc>
+        <w:tc>
+          <w:tcPr>
+            <w:tcW w:w="0" w:type="auto"/>
+            <w:hideMark/>
+          </w:tcPr>
+          <w:p>
+            <w:pPr>
+              <w:spacing w:after="160" w:line="278" w:lineRule="auto"/>
+              <w:cnfStyle w:val="000000100000" w:firstRow="0" w:lastRow="0" w:firstColumn="0" w:lastColumn="0" w:oddVBand="0" w:evenVBand="0" w:oddHBand="1" w:evenHBand="0" w:firstRowFirstColumn="0" w:firstRowLastColumn="0" w:lastRowFirstColumn="0" w:lastRowLastColumn="0"/>
+            </w:pPr>
+            <w:r>
+              <w:t xml:space="preserve">P1, P2, P3 y P5: validaciones y fórmula del promedio duplicadas, números mágicos y rangos de estado en </w:t>
+            </w:r>
+            <w:proofErr w:type="spellStart"/>
+            <w:r>
+              <w:t>if</w:t>
+            </w:r>
+            <w:proofErr w:type="spellEnd"/>
+            <w:r>
+              <w:t>/</w:t>
+            </w:r>
+            <w:proofErr w:type="spellStart"/>
+            <w:r>
+              <w:t>else</w:t>
+            </w:r>
+            <w:proofErr w:type="spellEnd"/>
+            <w:r>
+              <w:t xml:space="preserve"> dentro de </w:t>
+            </w:r>
+            <w:proofErr w:type="spellStart"/>
+            <w:r>
+              <w:t>App.jsx</w:t>
+            </w:r>
+            <w:proofErr w:type="spellEnd"/>
+            <w:r>
+              <w:t>.</w:t>
+            </w:r>
+          </w:p>
+        </w:tc>
+      </w:tr>
+      <w:tr>
+        <w:tc>
+          <w:tcPr>
+            <w:cnfStyle w:val="001000000000" w:firstRow="0" w:lastRow="0" w:firstColumn="1" w:lastColumn="0" w:oddVBand="0" w:evenVBand="0" w:oddHBand="0" w:evenHBand="0" w:firstRowFirstColumn="0" w:firstRowLastColumn="0" w:lastRowFirstColumn="0" w:lastRowLastColumn="0"/>
+            <w:tcW w:w="0" w:type="auto"/>
+            <w:hideMark/>
+          </w:tcPr>
+          <w:p>
+            <w:pPr>
+              <w:spacing w:after="160" w:line="278" w:lineRule="auto"/>
+            </w:pPr>
+            <w:r>
+              <w:t>Tipo de mantenimiento</w:t>
+            </w:r>
+          </w:p>
+        </w:tc>
+        <w:tc>
+          <w:tcPr>
+            <w:tcW w:w="0" w:type="auto"/>
+            <w:hideMark/>
+          </w:tcPr>
+          <w:p>
+            <w:pPr>
+              <w:spacing w:after="160" w:line="278" w:lineRule="auto"/>
+              <w:cnfStyle w:val="000000000000" w:firstRow="0" w:lastRow="0" w:firstColumn="0" w:lastColumn="0" w:oddVBand="0" w:evenVBand="0" w:oddHBand="0" w:evenHBand="0" w:firstRowFirstColumn="0" w:firstRowLastColumn="0" w:lastRowFirstColumn="0" w:lastRowLastColumn="0"/>
+            </w:pPr>
+            <w:r>
+              <w:t>Preventivo: se corrige un defecto latente (la inconsistencia descrita en la deuda técnica) antes de que llegue a producirse.</w:t>
+            </w:r>
+          </w:p>
+        </w:tc>
+      </w:tr>
+      <w:tr>
+        <w:trPr>
+          <w:cnfStyle w:val="000000100000" w:firstRow="0" w:lastRow="0" w:firstColumn="0" w:lastColumn="0" w:oddVBand="0" w:evenVBand="0" w:oddHBand="1" w:evenHBand="0" w:firstRowFirstColumn="0" w:firstRowLastColumn="0" w:lastRowFirstColumn="0" w:lastRowLastColumn="0"/>
+        </w:trPr>
+        <w:tc>
+          <w:tcPr>
+            <w:cnfStyle w:val="001000000000" w:firstRow="0" w:lastRow="0" w:firstColumn="1" w:lastColumn="0" w:oddVBand="0" w:evenVBand="0" w:oddHBand="0" w:evenHBand="0" w:firstRowFirstColumn="0" w:firstRowLastColumn="0" w:lastRowFirstColumn="0" w:lastRowLastColumn="0"/>
+            <w:tcW w:w="0" w:type="auto"/>
+            <w:hideMark/>
+          </w:tcPr>
+          <w:p>
+            <w:pPr>
+              <w:spacing w:after="160" w:line="278" w:lineRule="auto"/>
+            </w:pPr>
+            <w:r>
+              <w:t>Acción propuesta</w:t>
+            </w:r>
+          </w:p>
+        </w:tc>
+        <w:tc>
+          <w:tcPr>
+            <w:tcW w:w="0" w:type="auto"/>
+            <w:hideMark/>
+          </w:tcPr>
+          <w:p>
+            <w:pPr>
+              <w:spacing w:after="160" w:line="278" w:lineRule="auto"/>
+              <w:cnfStyle w:val="000000100000" w:firstRow="0" w:lastRow="0" w:firstColumn="0" w:lastColumn="0" w:oddVBand="0" w:evenVBand="0" w:oddHBand="1" w:evenHBand="0" w:firstRowFirstColumn="0" w:firstRowLastColumn="0" w:lastRowFirstColumn="0" w:lastRowLastColumn="0"/>
+            </w:pPr>
+            <w:r>
+              <w:t xml:space="preserve">Crear el módulo reglasAcademicas.js, con las constantes con nombre (PESO_T1, NOTA_APROBATORIA, etc.), la función </w:t>
+            </w:r>
+            <w:proofErr w:type="spellStart"/>
+            <w:proofErr w:type="gramStart"/>
+            <w:r>
+              <w:t>calcularPromedio</w:t>
+            </w:r>
+            <w:proofErr w:type="spellEnd"/>
+            <w:r>
+              <w:t>(</w:t>
+            </w:r>
+            <w:proofErr w:type="gramEnd"/>
+            <w:r>
+              <w:t xml:space="preserve">) y una tabla de rangos de estado. Crear también </w:t>
+            </w:r>
+            <w:proofErr w:type="spellStart"/>
+            <w:proofErr w:type="gramStart"/>
+            <w:r>
+              <w:t>validarEstudiante</w:t>
+            </w:r>
+            <w:proofErr w:type="spellEnd"/>
+            <w:r>
+              <w:t>(</w:t>
+            </w:r>
+            <w:proofErr w:type="gramEnd"/>
+            <w:r>
+              <w:t>) como función única, usada por el registro y por la edición.</w:t>
+            </w:r>
+          </w:p>
+        </w:tc>
+      </w:tr>
+      <w:tr>
+        <w:tc>
+          <w:tcPr>
+            <w:cnfStyle w:val="001000000000" w:firstRow="0" w:lastRow="0" w:firstColumn="1" w:lastColumn="0" w:oddVBand="0" w:evenVBand="0" w:oddHBand="0" w:evenHBand="0" w:firstRowFirstColumn="0" w:firstRowLastColumn="0" w:lastRowFirstColumn="0" w:lastRowLastColumn="0"/>
+            <w:tcW w:w="0" w:type="auto"/>
+            <w:hideMark/>
+          </w:tcPr>
+          <w:p>
+            <w:pPr>
+              <w:spacing w:after="160" w:line="278" w:lineRule="auto"/>
+            </w:pPr>
+            <w:r>
+              <w:lastRenderedPageBreak/>
+              <w:t>Beneficio esperado</w:t>
+            </w:r>
+          </w:p>
+        </w:tc>
+        <w:tc>
+          <w:tcPr>
+            <w:tcW w:w="0" w:type="auto"/>
+            <w:hideMark/>
+          </w:tcPr>
+          <w:p>
+            <w:pPr>
+              <w:spacing w:after="160" w:line="278" w:lineRule="auto"/>
+              <w:cnfStyle w:val="000000000000" w:firstRow="0" w:lastRow="0" w:firstColumn="0" w:lastColumn="0" w:oddVBand="0" w:evenVBand="0" w:oddHBand="0" w:evenHBand="0" w:firstRowFirstColumn="0" w:firstRowLastColumn="0" w:lastRowFirstColumn="0" w:lastRowLastColumn="0"/>
+            </w:pPr>
+            <w:r>
+              <w:t>Cada regla existe en un solo lugar (DRY) y cada módulo tiene una sola responsabilidad (SRP). Agregar un estado nuevo solo requiere añadir una fila a la tabla de rangos (OCP).</w:t>
+            </w:r>
+          </w:p>
+        </w:tc>
+      </w:tr>
+      <w:tr>
+        <w:trPr>
+          <w:cnfStyle w:val="000000100000" w:firstRow="0" w:lastRow="0" w:firstColumn="0" w:lastColumn="0" w:oddVBand="0" w:evenVBand="0" w:oddHBand="1" w:evenHBand="0" w:firstRowFirstColumn="0" w:firstRowLastColumn="0" w:lastRowFirstColumn="0" w:lastRowLastColumn="0"/>
+        </w:trPr>
+        <w:tc>
+          <w:tcPr>
+            <w:cnfStyle w:val="001000000000" w:firstRow="0" w:lastRow="0" w:firstColumn="1" w:lastColumn="0" w:oddVBand="0" w:evenVBand="0" w:oddHBand="0" w:evenHBand="0" w:firstRowFirstColumn="0" w:firstRowLastColumn="0" w:lastRowFirstColumn="0" w:lastRowLastColumn="0"/>
+            <w:tcW w:w="0" w:type="auto"/>
+            <w:hideMark/>
+          </w:tcPr>
+          <w:p>
+            <w:pPr>
+              <w:spacing w:after="160" w:line="278" w:lineRule="auto"/>
+            </w:pPr>
+            <w:r>
+              <w:t>Posible riesgo</w:t>
+            </w:r>
+          </w:p>
+        </w:tc>
+        <w:tc>
+          <w:tcPr>
+            <w:tcW w:w="0" w:type="auto"/>
+            <w:hideMark/>
+          </w:tcPr>
+          <w:p>
+            <w:pPr>
+              <w:spacing w:after="160" w:line="278" w:lineRule="auto"/>
+              <w:cnfStyle w:val="000000100000" w:firstRow="0" w:lastRow="0" w:firstColumn="0" w:lastColumn="0" w:oddVBand="0" w:evenVBand="0" w:oddHBand="1" w:evenHBand="0" w:firstRowFirstColumn="0" w:firstRowLastColumn="0" w:lastRowFirstColumn="0" w:lastRowLastColumn="0"/>
+            </w:pPr>
+            <w:r>
+              <w:t xml:space="preserve">Alterar sin querer el cálculo o la validación durante el traslado, por </w:t>
+            </w:r>
+            <w:r>
+              <w:t>ejemplo,</w:t>
+            </w:r>
+            <w:r>
+              <w:t xml:space="preserve"> cambiando &gt;= por &gt; en la nota aprobatoria.</w:t>
+            </w:r>
+          </w:p>
+        </w:tc>
+      </w:tr>
+      <w:tr>
+        <w:tc>
+          <w:tcPr>
+            <w:cnfStyle w:val="001000000000" w:firstRow="0" w:lastRow="0" w:firstColumn="1" w:lastColumn="0" w:oddVBand="0" w:evenVBand="0" w:oddHBand="0" w:evenHBand="0" w:firstRowFirstColumn="0" w:firstRowLastColumn="0" w:lastRowFirstColumn="0" w:lastRowLastColumn="0"/>
+            <w:tcW w:w="0" w:type="auto"/>
+            <w:hideMark/>
+          </w:tcPr>
+          <w:p>
+            <w:pPr>
+              <w:spacing w:after="160" w:line="278" w:lineRule="auto"/>
+            </w:pPr>
+            <w:r>
+              <w:t>Forma de verificación</w:t>
+            </w:r>
+          </w:p>
+        </w:tc>
+        <w:tc>
+          <w:tcPr>
+            <w:tcW w:w="0" w:type="auto"/>
+            <w:hideMark/>
+          </w:tcPr>
+          <w:p>
+            <w:pPr>
+              <w:spacing w:after="160" w:line="278" w:lineRule="auto"/>
+              <w:cnfStyle w:val="000000000000" w:firstRow="0" w:lastRow="0" w:firstColumn="0" w:lastColumn="0" w:oddVBand="0" w:evenVBand="0" w:oddHBand="0" w:evenHBand="0" w:firstRowFirstColumn="0" w:firstRowLastColumn="0" w:lastRowFirstColumn="0" w:lastRowLastColumn="0"/>
+            </w:pPr>
+            <w:r>
+              <w:t>Ejecutar los casos de prueba de la tabla siguiente antes y después del cambio; los resultados deben ser idénticos.</w:t>
+            </w:r>
+          </w:p>
+        </w:tc>
+      </w:tr>
+    </w:tbl>
+    <w:p/>
+    <w:p>
+      <w:pPr>
+        <w:rPr>
+          <w:b/>
+          <w:bCs/>
+        </w:rPr>
+      </w:pPr>
+      <w:r>
+        <w:rPr>
+          <w:b/>
+          <w:bCs/>
+        </w:rPr>
+        <w:t>Acción 2: Desacoplar la persistencia de datos</w:t>
+      </w:r>
+    </w:p>
+    <w:tbl>
+      <w:tblPr>
+        <w:tblStyle w:val="Tablanormal1"/>
+        <w:tblW w:w="0" w:type="auto"/>
+        <w:tblLook w:val="04A0" w:firstRow="1" w:lastRow="0" w:firstColumn="1" w:lastColumn="0" w:noHBand="0" w:noVBand="1"/>
+      </w:tblPr>
+      <w:tblGrid>
+        <w:gridCol w:w="1926"/>
+        <w:gridCol w:w="6902"/>
+      </w:tblGrid>
+      <w:tr>
+        <w:trPr>
+          <w:cnfStyle w:val="100000000000" w:firstRow="1" w:lastRow="0" w:firstColumn="0" w:lastColumn="0" w:oddVBand="0" w:evenVBand="0" w:oddHBand="0" w:evenHBand="0" w:firstRowFirstColumn="0" w:firstRowLastColumn="0" w:lastRowFirstColumn="0" w:lastRowLastColumn="0"/>
+        </w:trPr>
+        <w:tc>
+          <w:tcPr>
+            <w:cnfStyle w:val="001000000000" w:firstRow="0" w:lastRow="0" w:firstColumn="1" w:lastColumn="0" w:oddVBand="0" w:evenVBand="0" w:oddHBand="0" w:evenHBand="0" w:firstRowFirstColumn="0" w:firstRowLastColumn="0" w:lastRowFirstColumn="0" w:lastRowLastColumn="0"/>
+            <w:tcW w:w="0" w:type="auto"/>
+            <w:hideMark/>
+          </w:tcPr>
+          <w:p>
+            <w:pPr>
+              <w:spacing w:after="160" w:line="278" w:lineRule="auto"/>
+            </w:pPr>
+            <w:r>
+              <w:t>Campo</w:t>
+            </w:r>
+          </w:p>
+        </w:tc>
+        <w:tc>
+          <w:tcPr>
+            <w:tcW w:w="0" w:type="auto"/>
+            <w:hideMark/>
+          </w:tcPr>
+          <w:p>
+            <w:pPr>
+              <w:spacing w:after="160" w:line="278" w:lineRule="auto"/>
+              <w:cnfStyle w:val="100000000000" w:firstRow="1" w:lastRow="0" w:firstColumn="0" w:lastColumn="0" w:oddVBand="0" w:evenVBand="0" w:oddHBand="0" w:evenHBand="0" w:firstRowFirstColumn="0" w:firstRowLastColumn="0" w:lastRowFirstColumn="0" w:lastRowLastColumn="0"/>
+            </w:pPr>
+            <w:r>
+              <w:t>Descripción</w:t>
+            </w:r>
+          </w:p>
+        </w:tc>
+      </w:tr>
+      <w:tr>
+        <w:trPr>
+          <w:cnfStyle w:val="000000100000" w:firstRow="0" w:lastRow="0" w:firstColumn="0" w:lastColumn="0" w:oddVBand="0" w:evenVBand="0" w:oddHBand="1" w:evenHBand="0" w:firstRowFirstColumn="0" w:firstRowLastColumn="0" w:lastRowFirstColumn="0" w:lastRowLastColumn="0"/>
+        </w:trPr>
+        <w:tc>
+          <w:tcPr>
+            <w:cnfStyle w:val="001000000000" w:firstRow="0" w:lastRow="0" w:firstColumn="1" w:lastColumn="0" w:oddVBand="0" w:evenVBand="0" w:oddHBand="0" w:evenHBand="0" w:firstRowFirstColumn="0" w:firstRowLastColumn="0" w:lastRowFirstColumn="0" w:lastRowLastColumn="0"/>
+            <w:tcW w:w="0" w:type="auto"/>
+            <w:hideMark/>
+          </w:tcPr>
+          <w:p>
+            <w:pPr>
+              <w:spacing w:after="160" w:line="278" w:lineRule="auto"/>
+            </w:pPr>
+            <w:r>
+              <w:t>Problema identificado</w:t>
+            </w:r>
+          </w:p>
+        </w:tc>
+        <w:tc>
+          <w:tcPr>
+            <w:tcW w:w="0" w:type="auto"/>
+            <w:hideMark/>
+          </w:tcPr>
+          <w:p>
+            <w:pPr>
+              <w:spacing w:after="160" w:line="278" w:lineRule="auto"/>
+              <w:cnfStyle w:val="000000100000" w:firstRow="0" w:lastRow="0" w:firstColumn="0" w:lastColumn="0" w:oddVBand="0" w:evenVBand="0" w:oddHBand="1" w:evenHBand="0" w:firstRowFirstColumn="0" w:firstRowLastColumn="0" w:lastRowFirstColumn="0" w:lastRowLastColumn="0"/>
+            </w:pPr>
+            <w:r>
+              <w:t xml:space="preserve">P4: </w:t>
+            </w:r>
+            <w:proofErr w:type="spellStart"/>
+            <w:r>
+              <w:t>App.jsx</w:t>
+            </w:r>
+            <w:proofErr w:type="spellEnd"/>
+            <w:r>
+              <w:t xml:space="preserve"> accede directamente a </w:t>
+            </w:r>
+            <w:proofErr w:type="spellStart"/>
+            <w:r>
+              <w:t>localStorage</w:t>
+            </w:r>
+            <w:proofErr w:type="spellEnd"/>
+            <w:r>
+              <w:t xml:space="preserve"> en 4 lugares y repite la clave de almacenamiento.</w:t>
+            </w:r>
+          </w:p>
+        </w:tc>
+      </w:tr>
+      <w:tr>
+        <w:tc>
+          <w:tcPr>
+            <w:cnfStyle w:val="001000000000" w:firstRow="0" w:lastRow="0" w:firstColumn="1" w:lastColumn="0" w:oddVBand="0" w:evenVBand="0" w:oddHBand="0" w:evenHBand="0" w:firstRowFirstColumn="0" w:firstRowLastColumn="0" w:lastRowFirstColumn="0" w:lastRowLastColumn="0"/>
+            <w:tcW w:w="0" w:type="auto"/>
+            <w:hideMark/>
+          </w:tcPr>
+          <w:p>
+            <w:pPr>
+              <w:spacing w:after="160" w:line="278" w:lineRule="auto"/>
+            </w:pPr>
+            <w:r>
+              <w:t>Tipo de mantenimiento</w:t>
+            </w:r>
+          </w:p>
+        </w:tc>
+        <w:tc>
+          <w:tcPr>
+            <w:tcW w:w="0" w:type="auto"/>
+            <w:hideMark/>
+          </w:tcPr>
+          <w:p>
+            <w:pPr>
+              <w:spacing w:after="160" w:line="278" w:lineRule="auto"/>
+              <w:cnfStyle w:val="000000000000" w:firstRow="0" w:lastRow="0" w:firstColumn="0" w:lastColumn="0" w:oddVBand="0" w:evenVBand="0" w:oddHBand="0" w:evenHBand="0" w:firstRowFirstColumn="0" w:firstRowLastColumn="0" w:lastRowFirstColumn="0" w:lastRowLastColumn="0"/>
+            </w:pPr>
+            <w:r>
+              <w:t>Perfectivo: mejora la estructura interna y prepara la aplicación para cambios futuros sin agregar funcionalidades.</w:t>
+            </w:r>
+          </w:p>
+        </w:tc>
+      </w:tr>
+      <w:tr>
+        <w:trPr>
+          <w:cnfStyle w:val="000000100000" w:firstRow="0" w:lastRow="0" w:firstColumn="0" w:lastColumn="0" w:oddVBand="0" w:evenVBand="0" w:oddHBand="1" w:evenHBand="0" w:firstRowFirstColumn="0" w:firstRowLastColumn="0" w:lastRowFirstColumn="0" w:lastRowLastColumn="0"/>
+        </w:trPr>
+        <w:tc>
+          <w:tcPr>
+            <w:cnfStyle w:val="001000000000" w:firstRow="0" w:lastRow="0" w:firstColumn="1" w:lastColumn="0" w:oddVBand="0" w:evenVBand="0" w:oddHBand="0" w:evenHBand="0" w:firstRowFirstColumn="0" w:firstRowLastColumn="0" w:lastRowFirstColumn="0" w:lastRowLastColumn="0"/>
+            <w:tcW w:w="0" w:type="auto"/>
+            <w:hideMark/>
+          </w:tcPr>
+          <w:p>
+            <w:pPr>
+              <w:spacing w:after="160" w:line="278" w:lineRule="auto"/>
+            </w:pPr>
+            <w:r>
+              <w:t>Acción propuesta</w:t>
+            </w:r>
+          </w:p>
+        </w:tc>
+        <w:tc>
+          <w:tcPr>
+            <w:tcW w:w="0" w:type="auto"/>
+            <w:hideMark/>
+          </w:tcPr>
+          <w:p>
+            <w:pPr>
+              <w:spacing w:after="160" w:line="278" w:lineRule="auto"/>
+              <w:cnfStyle w:val="000000100000" w:firstRow="0" w:lastRow="0" w:firstColumn="0" w:lastColumn="0" w:oddVBand="0" w:evenVBand="0" w:oddHBand="1" w:evenHBand="0" w:firstRowFirstColumn="0" w:firstRowLastColumn="0" w:lastRowFirstColumn="0" w:lastRowLastColumn="0"/>
+            </w:pPr>
+            <w:r>
+              <w:t xml:space="preserve">Crear un servicio estudianteRepositorio.js con los métodos </w:t>
+            </w:r>
+            <w:proofErr w:type="spellStart"/>
+            <w:proofErr w:type="gramStart"/>
+            <w:r>
+              <w:t>obtenerTodos</w:t>
+            </w:r>
+            <w:proofErr w:type="spellEnd"/>
+            <w:r>
+              <w:t>(</w:t>
+            </w:r>
+            <w:proofErr w:type="gramEnd"/>
+            <w:r>
+              <w:t xml:space="preserve">) y </w:t>
+            </w:r>
+            <w:proofErr w:type="spellStart"/>
+            <w:proofErr w:type="gramStart"/>
+            <w:r>
+              <w:t>guardarTodos</w:t>
+            </w:r>
+            <w:proofErr w:type="spellEnd"/>
+            <w:r>
+              <w:t>(</w:t>
+            </w:r>
+            <w:proofErr w:type="gramEnd"/>
+            <w:r>
+              <w:t xml:space="preserve">), e </w:t>
+            </w:r>
+            <w:r>
+              <w:rPr>
+                <w:b/>
+                <w:bCs/>
+              </w:rPr>
+              <w:t>inyectarlo</w:t>
+            </w:r>
+            <w:r>
+              <w:t xml:space="preserve"> al componente como parámetro (</w:t>
+            </w:r>
+            <w:proofErr w:type="spellStart"/>
+            <w:r>
+              <w:rPr>
+                <w:i/>
+                <w:iCs/>
+              </w:rPr>
+              <w:t>prop</w:t>
+            </w:r>
+            <w:proofErr w:type="spellEnd"/>
+            <w:r>
+              <w:t xml:space="preserve">) en lugar de que </w:t>
+            </w:r>
+            <w:proofErr w:type="spellStart"/>
+            <w:r>
+              <w:t>App.jsx</w:t>
+            </w:r>
+            <w:proofErr w:type="spellEnd"/>
+            <w:r>
+              <w:t xml:space="preserve"> use </w:t>
+            </w:r>
+            <w:proofErr w:type="spellStart"/>
+            <w:r>
+              <w:t>localStorage</w:t>
+            </w:r>
+            <w:proofErr w:type="spellEnd"/>
+            <w:r>
+              <w:t xml:space="preserve"> directamente.</w:t>
+            </w:r>
+          </w:p>
+        </w:tc>
+      </w:tr>
+      <w:tr>
+        <w:tc>
+          <w:tcPr>
+            <w:cnfStyle w:val="001000000000" w:firstRow="0" w:lastRow="0" w:firstColumn="1" w:lastColumn="0" w:oddVBand="0" w:evenVBand="0" w:oddHBand="0" w:evenHBand="0" w:firstRowFirstColumn="0" w:firstRowLastColumn="0" w:lastRowFirstColumn="0" w:lastRowLastColumn="0"/>
+            <w:tcW w:w="0" w:type="auto"/>
+            <w:hideMark/>
+          </w:tcPr>
+          <w:p>
+            <w:pPr>
+              <w:spacing w:after="160" w:line="278" w:lineRule="auto"/>
+            </w:pPr>
+            <w:r>
+              <w:t>Beneficio esperado</w:t>
+            </w:r>
+          </w:p>
+        </w:tc>
+        <w:tc>
+          <w:tcPr>
+            <w:tcW w:w="0" w:type="auto"/>
+            <w:hideMark/>
+          </w:tcPr>
+          <w:p>
+            <w:pPr>
+              <w:spacing w:after="160" w:line="278" w:lineRule="auto"/>
+              <w:cnfStyle w:val="000000000000" w:firstRow="0" w:lastRow="0" w:firstColumn="0" w:lastColumn="0" w:oddVBand="0" w:evenVBand="0" w:oddHBand="0" w:evenHBand="0" w:firstRowFirstColumn="0" w:firstRowLastColumn="0" w:lastRowFirstColumn="0" w:lastRowLastColumn="0"/>
+            </w:pPr>
+            <w:r>
+              <w:t xml:space="preserve">El componente depende de una abstracción y no de un almacenamiento concreto (DIP). Cambiar a una API o base de datos solo requeriría crear otro repositorio con los mismos métodos, sin tocar </w:t>
+            </w:r>
+            <w:proofErr w:type="spellStart"/>
+            <w:r>
+              <w:t>App.jsx</w:t>
+            </w:r>
+            <w:proofErr w:type="spellEnd"/>
+            <w:r>
+              <w:t xml:space="preserve"> (inyección de dependencias).</w:t>
+            </w:r>
+          </w:p>
+        </w:tc>
+      </w:tr>
+      <w:tr>
+        <w:trPr>
+          <w:cnfStyle w:val="000000100000" w:firstRow="0" w:lastRow="0" w:firstColumn="0" w:lastColumn="0" w:oddVBand="0" w:evenVBand="0" w:oddHBand="1" w:evenHBand="0" w:firstRowFirstColumn="0" w:firstRowLastColumn="0" w:lastRowFirstColumn="0" w:lastRowLastColumn="0"/>
+        </w:trPr>
+        <w:tc>
+          <w:tcPr>
+            <w:cnfStyle w:val="001000000000" w:firstRow="0" w:lastRow="0" w:firstColumn="1" w:lastColumn="0" w:oddVBand="0" w:evenVBand="0" w:oddHBand="0" w:evenHBand="0" w:firstRowFirstColumn="0" w:firstRowLastColumn="0" w:lastRowFirstColumn="0" w:lastRowLastColumn="0"/>
+            <w:tcW w:w="0" w:type="auto"/>
+            <w:hideMark/>
+          </w:tcPr>
+          <w:p>
+            <w:pPr>
+              <w:spacing w:after="160" w:line="278" w:lineRule="auto"/>
+            </w:pPr>
+            <w:r>
+              <w:t>Posible riesgo</w:t>
+            </w:r>
+          </w:p>
+        </w:tc>
+        <w:tc>
+          <w:tcPr>
+            <w:tcW w:w="0" w:type="auto"/>
+            <w:hideMark/>
+          </w:tcPr>
+          <w:p>
+            <w:pPr>
+              <w:spacing w:after="160" w:line="278" w:lineRule="auto"/>
+              <w:cnfStyle w:val="000000100000" w:firstRow="0" w:lastRow="0" w:firstColumn="0" w:lastColumn="0" w:oddVBand="0" w:evenVBand="0" w:oddHBand="1" w:evenHBand="0" w:firstRowFirstColumn="0" w:firstRowLastColumn="0" w:lastRowFirstColumn="0" w:lastRowLastColumn="0"/>
+            </w:pPr>
+            <w:r>
+              <w:t>Que los datos ya guardados por la v1.0 no se carguen si cambia la clave o el formato de almacenamiento.</w:t>
+            </w:r>
+          </w:p>
+        </w:tc>
+      </w:tr>
+      <w:tr>
+        <w:tc>
+          <w:tcPr>
+            <w:cnfStyle w:val="001000000000" w:firstRow="0" w:lastRow="0" w:firstColumn="1" w:lastColumn="0" w:oddVBand="0" w:evenVBand="0" w:oddHBand="0" w:evenHBand="0" w:firstRowFirstColumn="0" w:firstRowLastColumn="0" w:lastRowFirstColumn="0" w:lastRowLastColumn="0"/>
+            <w:tcW w:w="0" w:type="auto"/>
+            <w:hideMark/>
+          </w:tcPr>
+          <w:p>
+            <w:pPr>
+              <w:spacing w:after="160" w:line="278" w:lineRule="auto"/>
+            </w:pPr>
+            <w:r>
+              <w:t>Forma de verificación</w:t>
+            </w:r>
+          </w:p>
+        </w:tc>
+        <w:tc>
+          <w:tcPr>
+            <w:tcW w:w="0" w:type="auto"/>
+            <w:hideMark/>
+          </w:tcPr>
+          <w:p>
+            <w:pPr>
+              <w:spacing w:after="160" w:line="278" w:lineRule="auto"/>
+              <w:cnfStyle w:val="000000000000" w:firstRow="0" w:lastRow="0" w:firstColumn="0" w:lastColumn="0" w:oddVBand="0" w:evenVBand="0" w:oddHBand="0" w:evenHBand="0" w:firstRowFirstColumn="0" w:firstRowLastColumn="0" w:lastRowFirstColumn="0" w:lastRowLastColumn="0"/>
+            </w:pPr>
+            <w:r>
+              <w:t>Registrar estudiantes en la v1.0, actualizar a la nueva versión y comprobar que siguen apareciendo al recargar la página. Ejecutar también los casos de prueba de la tabla siguiente.</w:t>
+            </w:r>
+          </w:p>
+        </w:tc>
+      </w:tr>
+    </w:tbl>
+    <w:p/>
+    <w:p>
+      <w:pPr>
+        <w:rPr>
+          <w:b/>
+          <w:bCs/>
+        </w:rPr>
+      </w:pPr>
+      <w:r>
+        <w:rPr>
+          <w:b/>
+          <w:bCs/>
+        </w:rPr>
+        <w:t>Casos de prueba para verificar ambas acciones</w:t>
+      </w:r>
+    </w:p>
+    <w:tbl>
+      <w:tblPr>
+        <w:tblStyle w:val="Tablanormal1"/>
+        <w:tblW w:w="0" w:type="auto"/>
+        <w:tblLook w:val="04A0" w:firstRow="1" w:lastRow="0" w:firstColumn="1" w:lastColumn="0" w:noHBand="0" w:noVBand="1"/>
+      </w:tblPr>
+      <w:tblGrid>
+        <w:gridCol w:w="1267"/>
+        <w:gridCol w:w="3279"/>
+        <w:gridCol w:w="4282"/>
+      </w:tblGrid>
+      <w:tr>
+        <w:trPr>
+          <w:cnfStyle w:val="100000000000" w:firstRow="1" w:lastRow="0" w:firstColumn="0" w:lastColumn="0" w:oddVBand="0" w:evenVBand="0" w:oddHBand="0" w:evenHBand="0" w:firstRowFirstColumn="0" w:firstRowLastColumn="0" w:lastRowFirstColumn="0" w:lastRowLastColumn="0"/>
+        </w:trPr>
+        <w:tc>
+          <w:tcPr>
+            <w:cnfStyle w:val="001000000000" w:firstRow="0" w:lastRow="0" w:firstColumn="1" w:lastColumn="0" w:oddVBand="0" w:evenVBand="0" w:oddHBand="0" w:evenHBand="0" w:firstRowFirstColumn="0" w:firstRowLastColumn="0" w:lastRowFirstColumn="0" w:lastRowLastColumn="0"/>
+            <w:tcW w:w="0" w:type="auto"/>
+            <w:hideMark/>
+          </w:tcPr>
+          <w:p>
+            <w:pPr>
+              <w:spacing w:after="160" w:line="278" w:lineRule="auto"/>
+            </w:pPr>
+            <w:r>
+              <w:t>Caso</w:t>
+            </w:r>
+          </w:p>
+        </w:tc>
+        <w:tc>
+          <w:tcPr>
+            <w:tcW w:w="0" w:type="auto"/>
+            <w:hideMark/>
+          </w:tcPr>
+          <w:p>
+            <w:pPr>
+              <w:spacing w:after="160" w:line="278" w:lineRule="auto"/>
+              <w:cnfStyle w:val="100000000000" w:firstRow="1" w:lastRow="0" w:firstColumn="0" w:lastColumn="0" w:oddVBand="0" w:evenVBand="0" w:oddHBand="0" w:evenHBand="0" w:firstRowFirstColumn="0" w:firstRowLastColumn="0" w:lastRowFirstColumn="0" w:lastRowLastColumn="0"/>
+            </w:pPr>
+            <w:r>
+              <w:t>Entrada (T1 / Parcial / Final)</w:t>
+            </w:r>
+          </w:p>
+        </w:tc>
+        <w:tc>
+          <w:tcPr>
+            <w:tcW w:w="0" w:type="auto"/>
+            <w:hideMark/>
+          </w:tcPr>
+          <w:p>
+            <w:pPr>
+              <w:spacing w:after="160" w:line="278" w:lineRule="auto"/>
+              <w:cnfStyle w:val="100000000000" w:firstRow="1" w:lastRow="0" w:firstColumn="0" w:lastColumn="0" w:oddVBand="0" w:evenVBand="0" w:oddHBand="0" w:evenHBand="0" w:firstRowFirstColumn="0" w:firstRowLastColumn="0" w:lastRowFirstColumn="0" w:lastRowLastColumn="0"/>
+            </w:pPr>
+            <w:r>
+              <w:t>Resultado esperado</w:t>
+            </w:r>
+          </w:p>
+        </w:tc>
+      </w:tr>
+      <w:tr>
+        <w:trPr>
+          <w:cnfStyle w:val="000000100000" w:firstRow="0" w:lastRow="0" w:firstColumn="0" w:lastColumn="0" w:oddVBand="0" w:evenVBand="0" w:oddHBand="1" w:evenHBand="0" w:firstRowFirstColumn="0" w:firstRowLastColumn="0" w:lastRowFirstColumn="0" w:lastRowLastColumn="0"/>
+        </w:trPr>
+        <w:tc>
+          <w:tcPr>
+            <w:cnfStyle w:val="001000000000" w:firstRow="0" w:lastRow="0" w:firstColumn="1" w:lastColumn="0" w:oddVBand="0" w:evenVBand="0" w:oddHBand="0" w:evenHBand="0" w:firstRowFirstColumn="0" w:firstRowLastColumn="0" w:lastRowFirstColumn="0" w:lastRowLastColumn="0"/>
+            <w:tcW w:w="0" w:type="auto"/>
+            <w:hideMark/>
+          </w:tcPr>
+          <w:p>
+            <w:pPr>
+              <w:spacing w:after="160" w:line="278" w:lineRule="auto"/>
+            </w:pPr>
+            <w:r>
+              <w:t>CP1</w:t>
+            </w:r>
+          </w:p>
+        </w:tc>
+        <w:tc>
+          <w:tcPr>
+            <w:tcW w:w="0" w:type="auto"/>
+            <w:hideMark/>
+          </w:tcPr>
+          <w:p>
+            <w:pPr>
+              <w:spacing w:after="160" w:line="278" w:lineRule="auto"/>
+              <w:cnfStyle w:val="000000100000" w:firstRow="0" w:lastRow="0" w:firstColumn="0" w:lastColumn="0" w:oddVBand="0" w:evenVBand="0" w:oddHBand="1" w:evenHBand="0" w:firstRowFirstColumn="0" w:firstRowLastColumn="0" w:lastRowFirstColumn="0" w:lastRowLastColumn="0"/>
+            </w:pPr>
+            <w:r>
+              <w:t>12 / 14 / 16</w:t>
+            </w:r>
+          </w:p>
+        </w:tc>
+        <w:tc>
+          <w:tcPr>
+            <w:tcW w:w="0" w:type="auto"/>
+            <w:hideMark/>
+          </w:tcPr>
+          <w:p>
+            <w:pPr>
+              <w:spacing w:after="160" w:line="278" w:lineRule="auto"/>
+              <w:cnfStyle w:val="000000100000" w:firstRow="0" w:lastRow="0" w:firstColumn="0" w:lastColumn="0" w:oddVBand="0" w:evenVBand="0" w:oddHBand="1" w:evenHBand="0" w:firstRowFirstColumn="0" w:firstRowLastColumn="0" w:lastRowFirstColumn="0" w:lastRowLastColumn="0"/>
+            </w:pPr>
+            <w:r>
+              <w:t>Promedio 14.20, Aprobado</w:t>
+            </w:r>
+          </w:p>
+        </w:tc>
+      </w:tr>
+      <w:tr>
+        <w:tc>
+          <w:tcPr>
+            <w:cnfStyle w:val="001000000000" w:firstRow="0" w:lastRow="0" w:firstColumn="1" w:lastColumn="0" w:oddVBand="0" w:evenVBand="0" w:oddHBand="0" w:evenHBand="0" w:firstRowFirstColumn="0" w:firstRowLastColumn="0" w:lastRowFirstColumn="0" w:lastRowLastColumn="0"/>
+            <w:tcW w:w="0" w:type="auto"/>
+            <w:hideMark/>
+          </w:tcPr>
+          <w:p>
+            <w:pPr>
+              <w:spacing w:after="160" w:line="278" w:lineRule="auto"/>
+            </w:pPr>
+            <w:r>
+              <w:t>CP2</w:t>
+            </w:r>
+          </w:p>
+        </w:tc>
+        <w:tc>
+          <w:tcPr>
+            <w:tcW w:w="0" w:type="auto"/>
+            <w:hideMark/>
+          </w:tcPr>
+          <w:p>
+            <w:pPr>
+              <w:spacing w:after="160" w:line="278" w:lineRule="auto"/>
+              <w:cnfStyle w:val="000000000000" w:firstRow="0" w:lastRow="0" w:firstColumn="0" w:lastColumn="0" w:oddVBand="0" w:evenVBand="0" w:oddHBand="0" w:evenHBand="0" w:firstRowFirstColumn="0" w:firstRowLastColumn="0" w:lastRowFirstColumn="0" w:lastRowLastColumn="0"/>
+            </w:pPr>
+            <w:r>
+              <w:t>18 / 17 / 18</w:t>
+            </w:r>
+          </w:p>
+        </w:tc>
+        <w:tc>
+          <w:tcPr>
+            <w:tcW w:w="0" w:type="auto"/>
+            <w:hideMark/>
+          </w:tcPr>
+          <w:p>
+            <w:pPr>
+              <w:spacing w:after="160" w:line="278" w:lineRule="auto"/>
+              <w:cnfStyle w:val="000000000000" w:firstRow="0" w:lastRow="0" w:firstColumn="0" w:lastColumn="0" w:oddVBand="0" w:evenVBand="0" w:oddHBand="0" w:evenHBand="0" w:firstRowFirstColumn="0" w:firstRowLastColumn="0" w:lastRowFirstColumn="0" w:lastRowLastColumn="0"/>
+            </w:pPr>
+            <w:r>
+              <w:t>Promedio 17.70, Destacado</w:t>
+            </w:r>
+          </w:p>
+        </w:tc>
+      </w:tr>
+      <w:tr>
+        <w:trPr>
+          <w:cnfStyle w:val="000000100000" w:firstRow="0" w:lastRow="0" w:firstColumn="0" w:lastColumn="0" w:oddVBand="0" w:evenVBand="0" w:oddHBand="1" w:evenHBand="0" w:firstRowFirstColumn="0" w:firstRowLastColumn="0" w:lastRowFirstColumn="0" w:lastRowLastColumn="0"/>
+        </w:trPr>
+        <w:tc>
+          <w:tcPr>
+            <w:cnfStyle w:val="001000000000" w:firstRow="0" w:lastRow="0" w:firstColumn="1" w:lastColumn="0" w:oddVBand="0" w:evenVBand="0" w:oddHBand="0" w:evenHBand="0" w:firstRowFirstColumn="0" w:firstRowLastColumn="0" w:lastRowFirstColumn="0" w:lastRowLastColumn="0"/>
+            <w:tcW w:w="0" w:type="auto"/>
+            <w:hideMark/>
+          </w:tcPr>
+          <w:p>
+            <w:pPr>
+              <w:spacing w:after="160" w:line="278" w:lineRule="auto"/>
+            </w:pPr>
+            <w:r>
+              <w:t>CP3</w:t>
+            </w:r>
+          </w:p>
+        </w:tc>
+        <w:tc>
+          <w:tcPr>
+            <w:tcW w:w="0" w:type="auto"/>
+            <w:hideMark/>
+          </w:tcPr>
+          <w:p>
+            <w:pPr>
+              <w:spacing w:after="160" w:line="278" w:lineRule="auto"/>
+              <w:cnfStyle w:val="000000100000" w:firstRow="0" w:lastRow="0" w:firstColumn="0" w:lastColumn="0" w:oddVBand="0" w:evenVBand="0" w:oddHBand="1" w:evenHBand="0" w:firstRowFirstColumn="0" w:firstRowLastColumn="0" w:lastRowFirstColumn="0" w:lastRowLastColumn="0"/>
+            </w:pPr>
+            <w:r>
+              <w:t>8 / 10 / 10</w:t>
+            </w:r>
+          </w:p>
+        </w:tc>
+        <w:tc>
+          <w:tcPr>
+            <w:tcW w:w="0" w:type="auto"/>
+            <w:hideMark/>
+          </w:tcPr>
+          <w:p>
+            <w:pPr>
+              <w:spacing w:after="160" w:line="278" w:lineRule="auto"/>
+              <w:cnfStyle w:val="000000100000" w:firstRow="0" w:lastRow="0" w:firstColumn="0" w:lastColumn="0" w:oddVBand="0" w:evenVBand="0" w:oddHBand="1" w:evenHBand="0" w:firstRowFirstColumn="0" w:firstRowLastColumn="0" w:lastRowFirstColumn="0" w:lastRowLastColumn="0"/>
+            </w:pPr>
+            <w:r>
+              <w:t>Promedio 9.40, Desaprobado</w:t>
+            </w:r>
+          </w:p>
+        </w:tc>
+      </w:tr>
+      <w:tr>
+        <w:tc>
+          <w:tcPr>
+            <w:cnfStyle w:val="001000000000" w:firstRow="0" w:lastRow="0" w:firstColumn="1" w:lastColumn="0" w:oddVBand="0" w:evenVBand="0" w:oddHBand="0" w:evenHBand="0" w:firstRowFirstColumn="0" w:firstRowLastColumn="0" w:lastRowFirstColumn="0" w:lastRowLastColumn="0"/>
+            <w:tcW w:w="0" w:type="auto"/>
+            <w:hideMark/>
+          </w:tcPr>
+          <w:p>
+            <w:pPr>
+              <w:spacing w:after="160" w:line="278" w:lineRule="auto"/>
+            </w:pPr>
+            <w:r>
+              <w:t>CP4 (límite)</w:t>
+            </w:r>
+          </w:p>
+        </w:tc>
+        <w:tc>
+          <w:tcPr>
+            <w:tcW w:w="0" w:type="auto"/>
+            <w:hideMark/>
+          </w:tcPr>
+          <w:p>
+            <w:pPr>
+              <w:spacing w:after="160" w:line="278" w:lineRule="auto"/>
+              <w:cnfStyle w:val="000000000000" w:firstRow="0" w:lastRow="0" w:firstColumn="0" w:lastColumn="0" w:oddVBand="0" w:evenVBand="0" w:oddHBand="0" w:evenHBand="0" w:firstRowFirstColumn="0" w:firstRowLastColumn="0" w:lastRowFirstColumn="0" w:lastRowLastColumn="0"/>
+            </w:pPr>
+            <w:r>
+              <w:t>10.5 / 10.5 / 10.5</w:t>
+            </w:r>
+          </w:p>
+        </w:tc>
+        <w:tc>
+          <w:tcPr>
+            <w:tcW w:w="0" w:type="auto"/>
+            <w:hideMark/>
+          </w:tcPr>
+          <w:p>
+            <w:pPr>
+              <w:spacing w:after="160" w:line="278" w:lineRule="auto"/>
+              <w:cnfStyle w:val="000000000000" w:firstRow="0" w:lastRow="0" w:firstColumn="0" w:lastColumn="0" w:oddVBand="0" w:evenVBand="0" w:oddHBand="0" w:evenHBand="0" w:firstRowFirstColumn="0" w:firstRowLastColumn="0" w:lastRowFirstColumn="0" w:lastRowLastColumn="0"/>
+            </w:pPr>
+            <w:r>
+              <w:t>Promedio 10.50, Aprobado</w:t>
+            </w:r>
+          </w:p>
+        </w:tc>
+      </w:tr>
+      <w:tr>
+        <w:trPr>
+          <w:cnfStyle w:val="000000100000" w:firstRow="0" w:lastRow="0" w:firstColumn="0" w:lastColumn="0" w:oddVBand="0" w:evenVBand="0" w:oddHBand="1" w:evenHBand="0" w:firstRowFirstColumn="0" w:firstRowLastColumn="0" w:lastRowFirstColumn="0" w:lastRowLastColumn="0"/>
+        </w:trPr>
+        <w:tc>
+          <w:tcPr>
+            <w:cnfStyle w:val="001000000000" w:firstRow="0" w:lastRow="0" w:firstColumn="1" w:lastColumn="0" w:oddVBand="0" w:evenVBand="0" w:oddHBand="0" w:evenHBand="0" w:firstRowFirstColumn="0" w:firstRowLastColumn="0" w:lastRowFirstColumn="0" w:lastRowLastColumn="0"/>
+            <w:tcW w:w="0" w:type="auto"/>
+            <w:hideMark/>
+          </w:tcPr>
+          <w:p>
+            <w:pPr>
+              <w:spacing w:after="160" w:line="278" w:lineRule="auto"/>
+            </w:pPr>
+            <w:r>
+              <w:lastRenderedPageBreak/>
+              <w:t>CP5 (límite)</w:t>
+            </w:r>
+          </w:p>
+        </w:tc>
+        <w:tc>
+          <w:tcPr>
+            <w:tcW w:w="0" w:type="auto"/>
+            <w:hideMark/>
+          </w:tcPr>
+          <w:p>
+            <w:pPr>
+              <w:spacing w:after="160" w:line="278" w:lineRule="auto"/>
+              <w:cnfStyle w:val="000000100000" w:firstRow="0" w:lastRow="0" w:firstColumn="0" w:lastColumn="0" w:oddVBand="0" w:evenVBand="0" w:oddHBand="1" w:evenHBand="0" w:firstRowFirstColumn="0" w:firstRowLastColumn="0" w:lastRowFirstColumn="0" w:lastRowLastColumn="0"/>
+            </w:pPr>
+            <w:r>
+              <w:t>17 / 17 / 17</w:t>
+            </w:r>
+          </w:p>
+        </w:tc>
+        <w:tc>
+          <w:tcPr>
+            <w:tcW w:w="0" w:type="auto"/>
+            <w:hideMark/>
+          </w:tcPr>
+          <w:p>
+            <w:pPr>
+              <w:spacing w:after="160" w:line="278" w:lineRule="auto"/>
+              <w:cnfStyle w:val="000000100000" w:firstRow="0" w:lastRow="0" w:firstColumn="0" w:lastColumn="0" w:oddVBand="0" w:evenVBand="0" w:oddHBand="1" w:evenHBand="0" w:firstRowFirstColumn="0" w:firstRowLastColumn="0" w:lastRowFirstColumn="0" w:lastRowLastColumn="0"/>
+            </w:pPr>
+            <w:r>
+              <w:t>Promedio 17.00, Destacado</w:t>
+            </w:r>
+          </w:p>
+        </w:tc>
+      </w:tr>
+      <w:tr>
+        <w:tc>
+          <w:tcPr>
+            <w:cnfStyle w:val="001000000000" w:firstRow="0" w:lastRow="0" w:firstColumn="1" w:lastColumn="0" w:oddVBand="0" w:evenVBand="0" w:oddHBand="0" w:evenHBand="0" w:firstRowFirstColumn="0" w:firstRowLastColumn="0" w:lastRowFirstColumn="0" w:lastRowLastColumn="0"/>
+            <w:tcW w:w="0" w:type="auto"/>
+            <w:hideMark/>
+          </w:tcPr>
+          <w:p>
+            <w:pPr>
+              <w:spacing w:after="160" w:line="278" w:lineRule="auto"/>
+            </w:pPr>
+            <w:r>
+              <w:t>CP6</w:t>
+            </w:r>
+          </w:p>
+        </w:tc>
+        <w:tc>
+          <w:tcPr>
+            <w:tcW w:w="0" w:type="auto"/>
+            <w:hideMark/>
+          </w:tcPr>
+          <w:p>
+            <w:pPr>
+              <w:spacing w:after="160" w:line="278" w:lineRule="auto"/>
+              <w:cnfStyle w:val="000000000000" w:firstRow="0" w:lastRow="0" w:firstColumn="0" w:lastColumn="0" w:oddVBand="0" w:evenVBand="0" w:oddHBand="0" w:evenHBand="0" w:firstRowFirstColumn="0" w:firstRowLastColumn="0" w:lastRowFirstColumn="0" w:lastRowLastColumn="0"/>
+            </w:pPr>
+            <w:r>
+              <w:t>Nota 21 en T1</w:t>
+            </w:r>
+          </w:p>
+        </w:tc>
+        <w:tc>
+          <w:tcPr>
+            <w:tcW w:w="0" w:type="auto"/>
+            <w:hideMark/>
+          </w:tcPr>
+          <w:p>
+            <w:pPr>
+              <w:spacing w:after="160" w:line="278" w:lineRule="auto"/>
+              <w:cnfStyle w:val="000000000000" w:firstRow="0" w:lastRow="0" w:firstColumn="0" w:lastColumn="0" w:oddVBand="0" w:evenVBand="0" w:oddHBand="0" w:evenHBand="0" w:firstRowFirstColumn="0" w:firstRowLastColumn="0" w:lastRowFirstColumn="0" w:lastRowLastColumn="0"/>
+            </w:pPr>
+            <w:r>
+              <w:t>Mensaje: "Las notas deben estar entre 0 y 20."</w:t>
+            </w:r>
+          </w:p>
+        </w:tc>
+      </w:tr>
+      <w:tr>
+        <w:trPr>
+          <w:cnfStyle w:val="000000100000" w:firstRow="0" w:lastRow="0" w:firstColumn="0" w:lastColumn="0" w:oddVBand="0" w:evenVBand="0" w:oddHBand="1" w:evenHBand="0" w:firstRowFirstColumn="0" w:firstRowLastColumn="0" w:lastRowFirstColumn="0" w:lastRowLastColumn="0"/>
+        </w:trPr>
+        <w:tc>
+          <w:tcPr>
+            <w:cnfStyle w:val="001000000000" w:firstRow="0" w:lastRow="0" w:firstColumn="1" w:lastColumn="0" w:oddVBand="0" w:evenVBand="0" w:oddHBand="0" w:evenHBand="0" w:firstRowFirstColumn="0" w:firstRowLastColumn="0" w:lastRowFirstColumn="0" w:lastRowLastColumn="0"/>
+            <w:tcW w:w="0" w:type="auto"/>
+            <w:hideMark/>
+          </w:tcPr>
+          <w:p>
+            <w:pPr>
+              <w:spacing w:after="160" w:line="278" w:lineRule="auto"/>
+            </w:pPr>
+            <w:r>
+              <w:t>CP7</w:t>
+            </w:r>
+          </w:p>
+        </w:tc>
+        <w:tc>
+          <w:tcPr>
+            <w:tcW w:w="0" w:type="auto"/>
+            <w:hideMark/>
+          </w:tcPr>
+          <w:p>
+            <w:pPr>
+              <w:spacing w:after="160" w:line="278" w:lineRule="auto"/>
+              <w:cnfStyle w:val="000000100000" w:firstRow="0" w:lastRow="0" w:firstColumn="0" w:lastColumn="0" w:oddVBand="0" w:evenVBand="0" w:oddHBand="1" w:evenHBand="0" w:firstRowFirstColumn="0" w:firstRowLastColumn="0" w:lastRowFirstColumn="0" w:lastRowLastColumn="0"/>
+            </w:pPr>
+            <w:r>
+              <w:t>Código ya registrado</w:t>
+            </w:r>
+          </w:p>
+        </w:tc>
+        <w:tc>
+          <w:tcPr>
+            <w:tcW w:w="0" w:type="auto"/>
+            <w:hideMark/>
+          </w:tcPr>
+          <w:p>
+            <w:pPr>
+              <w:spacing w:after="160" w:line="278" w:lineRule="auto"/>
+              <w:cnfStyle w:val="000000100000" w:firstRow="0" w:lastRow="0" w:firstColumn="0" w:lastColumn="0" w:oddVBand="0" w:evenVBand="0" w:oddHBand="1" w:evenHBand="0" w:firstRowFirstColumn="0" w:firstRowLastColumn="0" w:lastRowFirstColumn="0" w:lastRowLastColumn="0"/>
+            </w:pPr>
+            <w:r>
+              <w:t>Mensaje: "Ya existe un estudiante con ese código."</w:t>
+            </w:r>
+          </w:p>
+        </w:tc>
+      </w:tr>
+      <w:tr>
+        <w:tc>
+          <w:tcPr>
+            <w:cnfStyle w:val="001000000000" w:firstRow="0" w:lastRow="0" w:firstColumn="1" w:lastColumn="0" w:oddVBand="0" w:evenVBand="0" w:oddHBand="0" w:evenHBand="0" w:firstRowFirstColumn="0" w:firstRowLastColumn="0" w:lastRowFirstColumn="0" w:lastRowLastColumn="0"/>
+            <w:tcW w:w="0" w:type="auto"/>
+            <w:hideMark/>
+          </w:tcPr>
+          <w:p>
+            <w:pPr>
+              <w:spacing w:after="160" w:line="278" w:lineRule="auto"/>
+            </w:pPr>
+            <w:r>
+              <w:t>CP8</w:t>
+            </w:r>
+          </w:p>
+        </w:tc>
+        <w:tc>
+          <w:tcPr>
+            <w:tcW w:w="0" w:type="auto"/>
+            <w:hideMark/>
+          </w:tcPr>
+          <w:p>
+            <w:pPr>
+              <w:spacing w:after="160" w:line="278" w:lineRule="auto"/>
+              <w:cnfStyle w:val="000000000000" w:firstRow="0" w:lastRow="0" w:firstColumn="0" w:lastColumn="0" w:oddVBand="0" w:evenVBand="0" w:oddHBand="0" w:evenHBand="0" w:firstRowFirstColumn="0" w:firstRowLastColumn="0" w:lastRowFirstColumn="0" w:lastRowLastColumn="0"/>
+            </w:pPr>
+            <w:r>
+              <w:t>Registrar, luego recargar la página (F5)</w:t>
+            </w:r>
+          </w:p>
+        </w:tc>
+        <w:tc>
+          <w:tcPr>
+            <w:tcW w:w="0" w:type="auto"/>
+            <w:hideMark/>
+          </w:tcPr>
+          <w:p>
+            <w:pPr>
+              <w:spacing w:after="160" w:line="278" w:lineRule="auto"/>
+              <w:cnfStyle w:val="000000000000" w:firstRow="0" w:lastRow="0" w:firstColumn="0" w:lastColumn="0" w:oddVBand="0" w:evenVBand="0" w:oddHBand="0" w:evenHBand="0" w:firstRowFirstColumn="0" w:firstRowLastColumn="0" w:lastRowFirstColumn="0" w:lastRowLastColumn="0"/>
+            </w:pPr>
+            <w:r>
+              <w:t>Los estudiantes siguen en la lista</w:t>
+            </w:r>
+          </w:p>
+        </w:tc>
+      </w:tr>
+    </w:tbl>
+    <w:p>
+      <w:pPr>
+        <w:rPr>
+          <w:b/>
+          <w:bCs/>
+        </w:rPr>
+      </w:pPr>
     </w:p>
     <w:sectPr>
       <w:pgSz w:w="12240" w:h="15840"/>
@@ -3159,7 +5057,6 @@
     <w:next w:val="Normal"/>
     <w:link w:val="Ttulo3Car"/>
     <w:uiPriority w:val="9"/>
-    <w:semiHidden/>
     <w:unhideWhenUsed/>
     <w:qFormat/>
     <w:rsid w:val="00024CD2"/>
@@ -3182,7 +5079,6 @@
     <w:next w:val="Normal"/>
     <w:link w:val="Ttulo4Car"/>
     <w:uiPriority w:val="9"/>
-    <w:semiHidden/>
     <w:unhideWhenUsed/>
     <w:qFormat/>
     <w:rsid w:val="00024CD2"/>
@@ -3366,7 +5262,6 @@
     <w:basedOn w:val="Fuentedeprrafopredeter"/>
     <w:link w:val="Ttulo3"/>
     <w:uiPriority w:val="9"/>
-    <w:semiHidden/>
     <w:rsid w:val="00024CD2"/>
     <w:rPr>
       <w:rFonts w:eastAsiaTheme="majorEastAsia" w:cstheme="majorBidi"/>
@@ -3380,7 +5275,6 @@
     <w:basedOn w:val="Fuentedeprrafopredeter"/>
     <w:link w:val="Ttulo4"/>
     <w:uiPriority w:val="9"/>
-    <w:semiHidden/>
     <w:rsid w:val="00024CD2"/>
     <w:rPr>
       <w:rFonts w:eastAsiaTheme="majorEastAsia" w:cstheme="majorBidi"/>

</xml_diff>